<commit_message>
commit atualizacao sensoriamento remoto
</commit_message>
<xml_diff>
--- a/_site/desagregacao_temporal.docx
+++ b/_site/desagregacao_temporal.docx
@@ -7,31 +7,7 @@
         <w:pStyle w:val="Title"/>
       </w:pPr>
       <w:r>
-        <w:t xml:space="preserve">Desagregação</w:t>
-      </w:r>
-      <w:r>
-        <w:t xml:space="preserve"> </w:t>
-      </w:r>
-      <w:r>
-        <w:t xml:space="preserve">temporal</w:t>
-      </w:r>
-      <w:r>
-        <w:t xml:space="preserve"> </w:t>
-      </w:r>
-      <w:r>
-        <w:t xml:space="preserve">das</w:t>
-      </w:r>
-      <w:r>
-        <w:t xml:space="preserve"> </w:t>
-      </w:r>
-      <w:r>
-        <w:t xml:space="preserve">chuvas</w:t>
-      </w:r>
-      <w:r>
-        <w:t xml:space="preserve"> </w:t>
-      </w:r>
-      <w:r>
-        <w:t xml:space="preserve">intensas</w:t>
+        <w:t xml:space="preserve">Desagregação temporal das chuvas intensas</w:t>
       </w:r>
     </w:p>
     <w:p>
@@ -39,25 +15,7 @@
         <w:pStyle w:val="Author"/>
       </w:pPr>
       <w:r>
-        <w:t xml:space="preserve">Dirceu</w:t>
-      </w:r>
-      <w:r>
-        <w:t xml:space="preserve"> </w:t>
-      </w:r>
-      <w:r>
-        <w:t xml:space="preserve">S.</w:t>
-      </w:r>
-      <w:r>
-        <w:t xml:space="preserve"> </w:t>
-      </w:r>
-      <w:r>
-        <w:t xml:space="preserve">Reis</w:t>
-      </w:r>
-      <w:r>
-        <w:t xml:space="preserve"> </w:t>
-      </w:r>
-      <w:r>
-        <w:t xml:space="preserve">Jr.</w:t>
+        <w:t xml:space="preserve">Dirceu S. Reis Jr.</w:t>
       </w:r>
     </w:p>
     <w:bookmarkStart w:id="26" w:name="sec.desagregacao"/>
@@ -80,13 +38,7 @@
         <w:t xml:space="preserve"> </w:t>
       </w:r>
       <w:r>
-        <w:t xml:space="preserve">“</w:t>
-      </w:r>
-      <w:r>
-        <w:t xml:space="preserve">quebrar</w:t>
-      </w:r>
-      <w:r>
-        <w:t xml:space="preserve">”</w:t>
+        <w:t xml:space="preserve">“quebrar”</w:t>
       </w:r>
       <w:r>
         <w:t xml:space="preserve"> </w:t>
@@ -933,13 +885,7 @@
         <w:t xml:space="preserve"> </w:t>
       </w:r>
       <w:r>
-        <w:t xml:space="preserve">“</w:t>
-      </w:r>
-      <w:r>
-        <w:t xml:space="preserve">posições</w:t>
-      </w:r>
-      <w:r>
-        <w:t xml:space="preserve">”</w:t>
+        <w:t xml:space="preserve">“posições”</w:t>
       </w:r>
       <w:r>
         <w:t xml:space="preserve"> </w:t>
@@ -1877,8 +1823,8 @@
       </w:r>
       <w:r>
         <w:rPr>
+          <w:i/>
           <w:iCs/>
-          <w:i/>
         </w:rPr>
         <w:t xml:space="preserve">Evolutionary Annealing–Simplex</w:t>
       </w:r>
@@ -1897,13 +1843,7 @@
         <w:t xml:space="preserve"> </w:t>
       </w:r>
       <w:r>
-        <w:t xml:space="preserve">“</w:t>
-      </w:r>
-      <w:r>
-        <w:t xml:space="preserve">verificadas</w:t>
-      </w:r>
-      <w:r>
-        <w:t xml:space="preserve">”</w:t>
+        <w:t xml:space="preserve">“verificadas”</w:t>
       </w:r>
       <w:r>
         <w:t xml:space="preserve">; a desagregação deve, então, operar entre escalas superior e inferior escolhidas dentre essas escalas. Na seleção do gerador, comparam-se seis processos pontuais (BLRP5, BLRP6 com</w:t>
@@ -1941,13 +1881,7 @@
         <w:t xml:space="preserve"> </w:t>
       </w:r>
       <w:r>
-        <w:t xml:space="preserve">“</w:t>
-      </w:r>
-      <w:r>
-        <w:t xml:space="preserve">dias úmidos</w:t>
-      </w:r>
-      <w:r>
-        <w:t xml:space="preserve">”</w:t>
+        <w:t xml:space="preserve">“dias úmidos”</w:t>
       </w:r>
       <w:r>
         <w:t xml:space="preserve">, trabalha-se com sequências úmidas com nível superior (p.ex., blocos 3 h, 6 h ou 24 h), separadas por pelo menos um intervalo seco. Para cada sequência úmida, o gerador produz a série em passo fino; essa série é agregada de volta à escala superior e comparada ao registro observado por um critério de erro descrito pela equação:</w:t>
@@ -2607,13 +2541,7 @@
         <w:t xml:space="preserve"> </w:t>
       </w:r>
       <w:r>
-        <w:t xml:space="preserve">“</w:t>
-      </w:r>
-      <w:r>
-        <w:t xml:space="preserve">úmidos</w:t>
-      </w:r>
-      <w:r>
-        <w:t xml:space="preserve">”</w:t>
+        <w:t xml:space="preserve">“úmidos”</w:t>
       </w:r>
       <w:r>
         <w:t xml:space="preserve"> </w:t>
@@ -2639,13 +2567,7 @@
         <w:t xml:space="preserve">é um gerador incondicional de séries de precipitação que estende os modelos de clusters de Poisson (Neyman–Scott/Bartlett–Lewis). Assume chegadas de episódios segundo Poisson e distribuições para a duração do episódio e para as propriedades das células (chegada, duração, intensidade). Para superar a tendência clássica de subestimar extremos, incorpora quatro melhorias: (i) calibração visando momentos de 1ª a 3ª ordem das séries observadas; (ii) relação inversa entre duração e intensidade da célula, reforçando picos de curta duração; (iii) intensidade celular com distribuição Gama; (iv) dois algoritmos de embaralhamento (</w:t>
       </w:r>
       <w:r>
-        <w:t xml:space="preserve">“</w:t>
-      </w:r>
-      <w:r>
-        <w:t xml:space="preserve">shuffling</w:t>
-      </w:r>
-      <w:r>
-        <w:t xml:space="preserve">”</w:t>
+        <w:t xml:space="preserve">“shuffling”</w:t>
       </w:r>
       <w:r>
         <w:t xml:space="preserve">) que reproduzem autocorrelação de episódios e eventos persistentes. Para aplicações a cenários futuros, o fluxo é mensal: estatísticas de referência (média, variância, covariância, assimetria e proporção de períodos úmidos) são computadas em múltiplas agregações (10–960 min); regressões entre estatísticas (p.ex., média–variância, média–proporção úmida; e relações entre variâncias/proporções em diferentes agregações) são ajustadas; calcula-se um fator de mudança para a média diária (razão futuro/histórico), usado em conjunto com um gerador climático diário (p.ex., LARS-WG) para ancorar a média de 10 min no futuro; as estatísticas futuras para cada agregação são então derivadas via essas regressões (covariância e assimetria podem ser herdadas do clima atual quando a sensibilidade é fraca e faltam relações estáveis). Com esse conjunto estatístico, o modelo é calibrado e gera séries sub-horárias futuras preservando propriedades observadas e extremos em ampla faixa temporal. Os autores observaram que o WayDown tende a reproduzir melhor a mediana das estatísticas, enquanto o LetItRain fornece maior variabilidade de cenários. Ambos podem superestimar extremos até certo limiar e subestimar acima dele, explicitando o trade-off entre conservação de massa diária e liberdade estatística intradiária.</w:t>
@@ -2759,8 +2681,8 @@
       </w:r>
       <w:r>
         <w:rPr>
+          <w:i/>
           <w:iCs/>
-          <w:i/>
         </w:rPr>
         <w:t xml:space="preserve">rescaled-range</w:t>
       </w:r>
@@ -3131,13 +3053,7 @@
         <w:t xml:space="preserve"> </w:t>
       </w:r>
       <w:r>
-        <w:t xml:space="preserve">“</w:t>
-      </w:r>
-      <w:r>
-        <w:t xml:space="preserve">achatadas</w:t>
-      </w:r>
-      <w:r>
-        <w:t xml:space="preserve">”</w:t>
+        <w:t xml:space="preserve">“achatadas”</w:t>
       </w:r>
       <w:r>
         <w:t xml:space="preserve"> </w:t>
@@ -5517,13 +5433,7 @@
         <w:t xml:space="preserve"> </w:t>
       </w:r>
       <w:r>
-        <w:t xml:space="preserve">“</w:t>
-      </w:r>
-      <w:r>
-        <w:t xml:space="preserve">bruto</w:t>
-      </w:r>
-      <w:r>
-        <w:t xml:space="preserve">”</w:t>
+        <w:t xml:space="preserve">“bruto”</w:t>
       </w:r>
       <w:r>
         <w:t xml:space="preserve">, recomenda-se estimar</w:t>
@@ -8902,8 +8812,8 @@
       </w:r>
       <w:r>
         <w:rPr>
+          <w:i/>
           <w:iCs/>
-          <w:i/>
         </w:rPr>
         <w:t xml:space="preserve">multiscaling</w:t>
       </w:r>
@@ -9535,13 +9445,7 @@
         <w:t xml:space="preserve">, nesses casos diz-se que o processo apresenta multiescalamento (</w:t>
       </w:r>
       <w:r>
-        <w:t xml:space="preserve">“</w:t>
-      </w:r>
-      <w:r>
-        <w:t xml:space="preserve">multiscaling</w:t>
-      </w:r>
-      <w:r>
-        <w:t xml:space="preserve">”</w:t>
+        <w:t xml:space="preserve">“multiscaling”</w:t>
       </w:r>
       <w:r>
         <w:t xml:space="preserve">). Na prática, trabalha-se com séries de máximos anuais em várias durações e verifica-se regressão linear log–log dos momentos vs. duração para identificar o(s) regime(s) de escala.</w:t>
@@ -11106,13 +11010,7 @@
         <w:t xml:space="preserve"> </w:t>
       </w:r>
       <w:r>
-        <w:t xml:space="preserve">“</w:t>
-      </w:r>
-      <w:r>
-        <w:t xml:space="preserve">episódio</w:t>
-      </w:r>
-      <w:r>
-        <w:t xml:space="preserve">”</w:t>
+        <w:t xml:space="preserve">“episódio”</w:t>
       </w:r>
       <w:r>
         <w:t xml:space="preserve"> </w:t>
@@ -11251,13 +11149,7 @@
         <w:t xml:space="preserve"> </w:t>
       </w:r>
       <w:r>
-        <w:t xml:space="preserve">“</w:t>
-      </w:r>
-      <w:r>
-        <w:t xml:space="preserve">dar forma</w:t>
-      </w:r>
-      <w:r>
-        <w:t xml:space="preserve">”</w:t>
+        <w:t xml:space="preserve">“dar forma”</w:t>
       </w:r>
       <w:r>
         <w:t xml:space="preserve"> </w:t>
@@ -11428,13 +11320,7 @@
         <w:t xml:space="preserve"> </w:t>
       </w:r>
       <w:r>
-        <w:t xml:space="preserve">“</w:t>
-      </w:r>
-      <w:r>
-        <w:t xml:space="preserve">dressing</w:t>
-      </w:r>
-      <w:r>
-        <w:t xml:space="preserve">”</w:t>
+        <w:t xml:space="preserve">“dressing”</w:t>
       </w:r>
       <w:r>
         <w:t xml:space="preserve"> </w:t>
@@ -11587,13 +11473,7 @@
         <w:t xml:space="preserve"> </w:t>
       </w:r>
       <w:r>
-        <w:t xml:space="preserve">“</w:t>
-      </w:r>
-      <w:r>
-        <w:t xml:space="preserve">tempestades</w:t>
-      </w:r>
-      <w:r>
-        <w:t xml:space="preserve">”</w:t>
+        <w:t xml:space="preserve">“tempestades”</w:t>
       </w:r>
       <w:r>
         <w:t xml:space="preserve"> </w:t>
@@ -11726,13 +11606,7 @@
         <w:t xml:space="preserve"> </w:t>
       </w:r>
       <w:r>
-        <w:t xml:space="preserve">“</w:t>
-      </w:r>
-      <w:r>
-        <w:t xml:space="preserve">escala‐invariante</w:t>
-      </w:r>
-      <w:r>
-        <w:t xml:space="preserve">”</w:t>
+        <w:t xml:space="preserve">“escala‐invariante”</w:t>
       </w:r>
       <w:r>
         <w:t xml:space="preserve"> </w:t>
@@ -12179,8 +12053,8 @@
       </w:r>
       <w:r>
         <w:rPr>
+          <w:i/>
           <w:iCs/>
-          <w:i/>
         </w:rPr>
         <w:t xml:space="preserve">sandwich</w:t>
       </w:r>
@@ -13982,13 +13856,7 @@
         <w:t xml:space="preserve"> </w:t>
       </w:r>
       <w:r>
-        <w:t xml:space="preserve">“</w:t>
-      </w:r>
-      <w:r>
-        <w:t xml:space="preserve">empresta força</w:t>
-      </w:r>
-      <w:r>
-        <w:t xml:space="preserve">”</w:t>
+        <w:t xml:space="preserve">“empresta força”</w:t>
       </w:r>
       <w:r>
         <w:t xml:space="preserve"> </w:t>
@@ -15887,13 +15755,7 @@
         <w:t xml:space="preserve"> </w:t>
       </w:r>
       <w:r>
-        <w:t xml:space="preserve">“</w:t>
-      </w:r>
-      <w:r>
-        <w:t xml:space="preserve">piecewise</w:t>
-      </w:r>
-      <w:r>
-        <w:t xml:space="preserve">”</w:t>
+        <w:t xml:space="preserve">“piecewise”</w:t>
       </w:r>
       <w:r>
         <w:t xml:space="preserve"> </w:t>
@@ -16431,13 +16293,7 @@
         <w:t xml:space="preserve"> </w:t>
       </w:r>
       <w:r>
-        <w:t xml:space="preserve">“</w:t>
-      </w:r>
-      <w:r>
-        <w:t xml:space="preserve">quebras</w:t>
-      </w:r>
-      <w:r>
-        <w:t xml:space="preserve">”</w:t>
+        <w:t xml:space="preserve">“quebras”</w:t>
       </w:r>
       <w:r>
         <w:t xml:space="preserve">). Em contraste com esquemas clássicos, a expressão explicita</w:t>
@@ -18574,13 +18430,7 @@
         <w:t xml:space="preserve"> </w:t>
       </w:r>
       <w:r>
-        <w:t xml:space="preserve">“</w:t>
-      </w:r>
-      <w:r>
-        <w:t xml:space="preserve">real</w:t>
-      </w:r>
-      <w:r>
-        <w:t xml:space="preserve">”</w:t>
+        <w:t xml:space="preserve">“real”</w:t>
       </w:r>
       <w:r>
         <w:t xml:space="preserve">,</w:t>
@@ -19511,16 +19361,16 @@
     </w:p>
     <w:p>
       <w:pPr>
+        <w:pStyle w:val="Compact"/>
         <w:numPr>
           <w:ilvl w:val="0"/>
           <w:numId w:val="1002"/>
         </w:numPr>
-        <w:pStyle w:val="Compact"/>
       </w:pPr>
       <w:r>
         <w:rPr>
+          <w:b/>
           <w:bCs/>
-          <w:b/>
         </w:rPr>
         <w:t xml:space="preserve">Técnicas Não Paramétricas / Reamostragem</w:t>
       </w:r>
@@ -19536,13 +19386,7 @@
         <w:t xml:space="preserve"> </w:t>
       </w:r>
       <w:r>
-        <w:t xml:space="preserve">“</w:t>
-      </w:r>
-      <w:r>
-        <w:t xml:space="preserve">fragmentos</w:t>
-      </w:r>
-      <w:r>
-        <w:t xml:space="preserve">”</w:t>
+        <w:t xml:space="preserve">“fragmentos”</w:t>
       </w:r>
       <w:r>
         <w:t xml:space="preserve"> </w:t>
@@ -19769,9 +19613,9 @@
       </w:pPr>
       <w:r>
         <w:t xml:space="preserve">$$
-\widehat{\mathbf{x}}_{i^\*,m}
-\;=\; P_{i^\*}\cdot \mathrm{fr}_{i^\*,m,s^\*}
-$$</w:t>
+    \widehat{\mathbf{x}}_{i^\*,m}
+    \;=\; P_{i^\*}\cdot \mathrm{fr}_{i^\*,m,s^\*}
+    $$</w:t>
       </w:r>
     </w:p>
     <w:p>
@@ -20675,13 +20519,7 @@
         <w:t xml:space="preserve"> </w:t>
       </w:r>
       <w:r>
-        <w:t xml:space="preserve">“</w:t>
-      </w:r>
-      <w:r>
-        <w:t xml:space="preserve">pai</w:t>
-      </w:r>
-      <w:r>
-        <w:t xml:space="preserve">”</w:t>
+        <w:t xml:space="preserve">“pai”</w:t>
       </w:r>
       <w:r>
         <w:t xml:space="preserve"> </w:t>
@@ -21192,13 +21030,7 @@
         <w:t xml:space="preserve"> </w:t>
       </w:r>
       <w:r>
-        <w:t xml:space="preserve">“</w:t>
-      </w:r>
-      <w:r>
-        <w:t xml:space="preserve">inflar</w:t>
-      </w:r>
-      <w:r>
-        <w:t xml:space="preserve">”</w:t>
+        <w:t xml:space="preserve">“inflar”</w:t>
       </w:r>
       <w:r>
         <w:t xml:space="preserve"> </w:t>
@@ -21344,13 +21176,7 @@
         <w:t xml:space="preserve"> </w:t>
       </w:r>
       <w:r>
-        <w:t xml:space="preserve">“</w:t>
-      </w:r>
-      <w:r>
-        <w:t xml:space="preserve">sucesso</w:t>
-      </w:r>
-      <w:r>
-        <w:t xml:space="preserve">”</w:t>
+        <w:t xml:space="preserve">“sucesso”</w:t>
       </w:r>
       <w:r>
         <w:t xml:space="preserve"> </w:t>
@@ -22633,16 +22459,16 @@
     </w:p>
     <w:p>
       <w:pPr>
+        <w:pStyle w:val="Compact"/>
         <w:numPr>
           <w:ilvl w:val="0"/>
           <w:numId w:val="1003"/>
         </w:numPr>
-        <w:pStyle w:val="Compact"/>
       </w:pPr>
       <w:r>
         <w:rPr>
+          <w:b/>
           <w:bCs/>
-          <w:b/>
         </w:rPr>
         <w:t xml:space="preserve">Modelagem Hierárquica de Extremos</w:t>
       </w:r>
@@ -22658,13 +22484,7 @@
         <w:t xml:space="preserve"> </w:t>
       </w:r>
       <w:r>
-        <w:t xml:space="preserve">“</w:t>
-      </w:r>
-      <w:r>
-        <w:t xml:space="preserve">empresta informação</w:t>
-      </w:r>
-      <w:r>
-        <w:t xml:space="preserve">”</w:t>
+        <w:t xml:space="preserve">“empresta informação”</w:t>
       </w:r>
       <w:r>
         <w:t xml:space="preserve"> </w:t>
@@ -26296,13 +26116,7 @@
         <w:t xml:space="preserve"> </w:t>
       </w:r>
       <w:r>
-        <w:t xml:space="preserve">“</w:t>
-      </w:r>
-      <w:r>
-        <w:t xml:space="preserve">amarrando</w:t>
-      </w:r>
-      <w:r>
-        <w:t xml:space="preserve">”</w:t>
+        <w:t xml:space="preserve">“amarrando”</w:t>
       </w:r>
       <w:r>
         <w:t xml:space="preserve"> </w:t>
@@ -27217,13 +27031,7 @@
         <w:t xml:space="preserve"> </w:t>
       </w:r>
       <w:r>
-        <w:t xml:space="preserve">“</w:t>
-      </w:r>
-      <w:r>
-        <w:t xml:space="preserve">escala simples + GEV</w:t>
-      </w:r>
-      <w:r>
-        <w:t xml:space="preserve">”</w:t>
+        <w:t xml:space="preserve">“escala simples + GEV”</w:t>
       </w:r>
       <w:r>
         <w:t xml:space="preserve"> </w:t>
@@ -27844,8 +27652,8 @@
       </w:r>
       <w:r>
         <w:rPr>
+          <w:i/>
           <w:iCs/>
-          <w:i/>
         </w:rPr>
         <w:t xml:space="preserve">overfitting</w:t>
       </w:r>
@@ -27865,8 +27673,8 @@
       </w:r>
       <w:r>
         <w:rPr>
+          <w:i/>
           <w:iCs/>
-          <w:i/>
         </w:rPr>
         <w:t xml:space="preserve">convection-permitting</w:t>
       </w:r>
@@ -28467,13 +28275,7 @@
         <w:t xml:space="preserve"> </w:t>
       </w:r>
       <w:r>
-        <w:t xml:space="preserve">“</w:t>
-      </w:r>
-      <w:r>
-        <w:t xml:space="preserve">deslocamento</w:t>
-      </w:r>
-      <w:r>
-        <w:t xml:space="preserve">”</w:t>
+        <w:t xml:space="preserve">“deslocamento”</w:t>
       </w:r>
       <w:r>
         <w:t xml:space="preserve"> </w:t>
@@ -28641,13 +28443,7 @@
         <w:t xml:space="preserve"> </w:t>
       </w:r>
       <w:r>
-        <w:t xml:space="preserve">“</w:t>
-      </w:r>
-      <w:r>
-        <w:t xml:space="preserve">3 parâmetros × número de durações</w:t>
-      </w:r>
-      <w:r>
-        <w:t xml:space="preserve">”</w:t>
+        <w:t xml:space="preserve">“3 parâmetros × número de durações”</w:t>
       </w:r>
       <w:r>
         <w:t xml:space="preserve"> </w:t>
@@ -28667,13 +28463,7 @@
         <w:t xml:space="preserve"> </w:t>
       </w:r>
       <w:r>
-        <w:t xml:space="preserve">“</w:t>
-      </w:r>
-      <w:r>
-        <w:t xml:space="preserve">ligadas</w:t>
-      </w:r>
-      <w:r>
-        <w:t xml:space="preserve">”</w:t>
+        <w:t xml:space="preserve">“ligadas”</w:t>
       </w:r>
       <w:r>
         <w:t xml:space="preserve"> </w:t>
@@ -28685,13 +28475,7 @@
         <w:t xml:space="preserve"> </w:t>
       </w:r>
       <w:r>
-        <w:t xml:space="preserve">“</w:t>
-      </w:r>
-      <w:r>
-        <w:t xml:space="preserve">nugget de duração</w:t>
-      </w:r>
-      <w:r>
-        <w:t xml:space="preserve">”</w:t>
+        <w:t xml:space="preserve">“nugget de duração”</w:t>
       </w:r>
       <w:r>
         <w:t xml:space="preserve"> </w:t>
@@ -28922,8 +28706,8 @@
       </w:r>
       <w:r>
         <w:rPr>
+          <w:i/>
           <w:iCs/>
-          <w:i/>
         </w:rPr>
         <w:t xml:space="preserve">Brazilian Archives of Biology and Technology</w:t>
       </w:r>
@@ -28974,8 +28758,8 @@
       </w:r>
       <w:r>
         <w:rPr>
+          <w:i/>
           <w:iCs/>
-          <w:i/>
         </w:rPr>
         <w:t xml:space="preserve">RBRH</w:t>
       </w:r>
@@ -29026,8 +28810,8 @@
       </w:r>
       <w:r>
         <w:rPr>
+          <w:i/>
           <w:iCs/>
-          <w:i/>
         </w:rPr>
         <w:t xml:space="preserve">Water Resources Research</w:t>
       </w:r>
@@ -29078,8 +28862,8 @@
       </w:r>
       <w:r>
         <w:rPr>
+          <w:i/>
           <w:iCs/>
-          <w:i/>
         </w:rPr>
         <w:t xml:space="preserve">Stochastic Environmental Research and Risk Assessment</w:t>
       </w:r>
@@ -29130,8 +28914,8 @@
       </w:r>
       <w:r>
         <w:rPr>
+          <w:i/>
           <w:iCs/>
-          <w:i/>
         </w:rPr>
         <w:t xml:space="preserve">Stochastic Environmental Research and Risk Assessment</w:t>
       </w:r>
@@ -29182,8 +28966,8 @@
       </w:r>
       <w:r>
         <w:rPr>
+          <w:i/>
           <w:iCs/>
-          <w:i/>
         </w:rPr>
         <w:t xml:space="preserve">Engenharia Sanitaria e Ambiental</w:t>
       </w:r>
@@ -29234,8 +29018,8 @@
       </w:r>
       <w:r>
         <w:rPr>
+          <w:i/>
           <w:iCs/>
-          <w:i/>
         </w:rPr>
         <w:t xml:space="preserve">Environmental Research Letters</w:t>
       </w:r>
@@ -29286,8 +29070,8 @@
       </w:r>
       <w:r>
         <w:rPr>
+          <w:i/>
           <w:iCs/>
-          <w:i/>
         </w:rPr>
         <w:t xml:space="preserve">Journal of Hydrology</w:t>
       </w:r>
@@ -29338,8 +29122,8 @@
       </w:r>
       <w:r>
         <w:rPr>
+          <w:i/>
           <w:iCs/>
-          <w:i/>
         </w:rPr>
         <w:t xml:space="preserve">Water Resources Management</w:t>
       </w:r>
@@ -29390,8 +29174,8 @@
       </w:r>
       <w:r>
         <w:rPr>
+          <w:i/>
           <w:iCs/>
-          <w:i/>
         </w:rPr>
         <w:t xml:space="preserve">Natural Hazards</w:t>
       </w:r>
@@ -29442,8 +29226,8 @@
       </w:r>
       <w:r>
         <w:rPr>
+          <w:i/>
           <w:iCs/>
-          <w:i/>
         </w:rPr>
         <w:t xml:space="preserve">Journal of Hydrology</w:t>
       </w:r>
@@ -29530,8 +29314,8 @@
       </w:r>
       <w:r>
         <w:rPr>
+          <w:i/>
           <w:iCs/>
-          <w:i/>
         </w:rPr>
         <w:t xml:space="preserve">Journal of Agricultural, Biological, and Environmental Statistics</w:t>
       </w:r>
@@ -29582,8 +29366,8 @@
       </w:r>
       <w:r>
         <w:rPr>
+          <w:i/>
           <w:iCs/>
-          <w:i/>
         </w:rPr>
         <w:t xml:space="preserve">Environmental Research Letters</w:t>
       </w:r>
@@ -29634,8 +29418,8 @@
       </w:r>
       <w:r>
         <w:rPr>
+          <w:i/>
           <w:iCs/>
-          <w:i/>
         </w:rPr>
         <w:t xml:space="preserve">Journal of Hydrology</w:t>
       </w:r>
@@ -29722,8 +29506,8 @@
       </w:r>
       <w:r>
         <w:rPr>
+          <w:i/>
           <w:iCs/>
-          <w:i/>
         </w:rPr>
         <w:t xml:space="preserve">Journal of Hydrology</w:t>
       </w:r>
@@ -29774,8 +29558,8 @@
       </w:r>
       <w:r>
         <w:rPr>
+          <w:i/>
           <w:iCs/>
-          <w:i/>
         </w:rPr>
         <w:t xml:space="preserve">Hydrological Sciences Journal</w:t>
       </w:r>
@@ -29826,8 +29610,8 @@
       </w:r>
       <w:r>
         <w:rPr>
+          <w:i/>
           <w:iCs/>
-          <w:i/>
         </w:rPr>
         <w:t xml:space="preserve">Advances in Water Resources</w:t>
       </w:r>
@@ -29878,8 +29662,8 @@
       </w:r>
       <w:r>
         <w:rPr>
+          <w:i/>
           <w:iCs/>
-          <w:i/>
         </w:rPr>
         <w:t xml:space="preserve">Weather and Climate Extremes</w:t>
       </w:r>
@@ -29966,8 +29750,8 @@
       </w:r>
       <w:r>
         <w:rPr>
+          <w:i/>
           <w:iCs/>
-          <w:i/>
         </w:rPr>
         <w:t xml:space="preserve">Journal of Geophysical Research: Atmospheres</w:t>
       </w:r>
@@ -30018,8 +29802,8 @@
       </w:r>
       <w:r>
         <w:rPr>
+          <w:i/>
           <w:iCs/>
-          <w:i/>
         </w:rPr>
         <w:t xml:space="preserve">Hydrology and Earth System Sciences</w:t>
       </w:r>
@@ -30070,8 +29854,8 @@
       </w:r>
       <w:r>
         <w:rPr>
+          <w:i/>
           <w:iCs/>
-          <w:i/>
         </w:rPr>
         <w:t xml:space="preserve">Water Resources Research</w:t>
       </w:r>
@@ -30122,8 +29906,8 @@
       </w:r>
       <w:r>
         <w:rPr>
+          <w:i/>
           <w:iCs/>
-          <w:i/>
         </w:rPr>
         <w:t xml:space="preserve">Water Resources Research</w:t>
       </w:r>
@@ -30174,8 +29958,8 @@
       </w:r>
       <w:r>
         <w:rPr>
+          <w:i/>
           <w:iCs/>
-          <w:i/>
         </w:rPr>
         <w:t xml:space="preserve">Water Resources Research</w:t>
       </w:r>
@@ -30226,8 +30010,8 @@
       </w:r>
       <w:r>
         <w:rPr>
+          <w:i/>
           <w:iCs/>
-          <w:i/>
         </w:rPr>
         <w:t xml:space="preserve">Hydrology and Earth System Sciences</w:t>
       </w:r>
@@ -30278,8 +30062,8 @@
       </w:r>
       <w:r>
         <w:rPr>
+          <w:i/>
           <w:iCs/>
-          <w:i/>
         </w:rPr>
         <w:t xml:space="preserve">Journal of Hydrology</w:t>
       </w:r>
@@ -30330,8 +30114,8 @@
       </w:r>
       <w:r>
         <w:rPr>
+          <w:i/>
           <w:iCs/>
-          <w:i/>
         </w:rPr>
         <w:t xml:space="preserve">Water Resources Research</w:t>
       </w:r>
@@ -30382,8 +30166,8 @@
       </w:r>
       <w:r>
         <w:rPr>
+          <w:i/>
           <w:iCs/>
-          <w:i/>
         </w:rPr>
         <w:t xml:space="preserve">Bulletin of the American Meteorological Society</w:t>
       </w:r>
@@ -30434,8 +30218,8 @@
       </w:r>
       <w:r>
         <w:rPr>
+          <w:i/>
           <w:iCs/>
-          <w:i/>
         </w:rPr>
         <w:t xml:space="preserve">Water Resources Research</w:t>
       </w:r>
@@ -30486,8 +30270,8 @@
       </w:r>
       <w:r>
         <w:rPr>
+          <w:i/>
           <w:iCs/>
-          <w:i/>
         </w:rPr>
         <w:t xml:space="preserve">Journal of Applied Meteorology and Climatology</w:t>
       </w:r>
@@ -30538,8 +30322,8 @@
       </w:r>
       <w:r>
         <w:rPr>
+          <w:i/>
           <w:iCs/>
-          <w:i/>
         </w:rPr>
         <w:t xml:space="preserve">Water Resources Research</w:t>
       </w:r>
@@ -30590,8 +30374,8 @@
       </w:r>
       <w:r>
         <w:rPr>
+          <w:i/>
           <w:iCs/>
-          <w:i/>
         </w:rPr>
         <w:t xml:space="preserve">Water Resources Research</w:t>
       </w:r>
@@ -30642,8 +30426,8 @@
       </w:r>
       <w:r>
         <w:rPr>
+          <w:i/>
           <w:iCs/>
-          <w:i/>
         </w:rPr>
         <w:t xml:space="preserve">Water Science and Technology</w:t>
       </w:r>
@@ -30694,8 +30478,8 @@
       </w:r>
       <w:r>
         <w:rPr>
+          <w:i/>
           <w:iCs/>
-          <w:i/>
         </w:rPr>
         <w:t xml:space="preserve">Water Resources Research</w:t>
       </w:r>
@@ -30746,8 +30530,8 @@
       </w:r>
       <w:r>
         <w:rPr>
+          <w:i/>
           <w:iCs/>
-          <w:i/>
         </w:rPr>
         <w:t xml:space="preserve">Water Resources Research</w:t>
       </w:r>
@@ -30798,8 +30582,8 @@
       </w:r>
       <w:r>
         <w:rPr>
+          <w:i/>
           <w:iCs/>
-          <w:i/>
         </w:rPr>
         <w:t xml:space="preserve">Journal of Hydrology</w:t>
       </w:r>
@@ -30850,8 +30634,8 @@
       </w:r>
       <w:r>
         <w:rPr>
+          <w:i/>
           <w:iCs/>
-          <w:i/>
         </w:rPr>
         <w:t xml:space="preserve">Journal of Hydrology: Regional Studies</w:t>
       </w:r>
@@ -30902,8 +30686,8 @@
       </w:r>
       <w:r>
         <w:rPr>
+          <w:i/>
           <w:iCs/>
-          <w:i/>
         </w:rPr>
         <w:t xml:space="preserve">Journal of Hydrologic Engineering</w:t>
       </w:r>
@@ -30954,8 +30738,8 @@
       </w:r>
       <w:r>
         <w:rPr>
+          <w:i/>
           <w:iCs/>
-          <w:i/>
         </w:rPr>
         <w:t xml:space="preserve">Natural Hazards and Earth System Sciences</w:t>
       </w:r>
@@ -31006,8 +30790,8 @@
       </w:r>
       <w:r>
         <w:rPr>
+          <w:i/>
           <w:iCs/>
-          <w:i/>
         </w:rPr>
         <w:t xml:space="preserve">Weather and Climate Extremes</w:t>
       </w:r>
@@ -31058,8 +30842,8 @@
       </w:r>
       <w:r>
         <w:rPr>
+          <w:i/>
           <w:iCs/>
-          <w:i/>
         </w:rPr>
         <w:t xml:space="preserve">Journal of Water and Climate Change</w:t>
       </w:r>
@@ -31110,8 +30894,8 @@
       </w:r>
       <w:r>
         <w:rPr>
+          <w:i/>
           <w:iCs/>
-          <w:i/>
         </w:rPr>
         <w:t xml:space="preserve">Hydrology and Earth System Sciences</w:t>
       </w:r>
@@ -31162,8 +30946,8 @@
       </w:r>
       <w:r>
         <w:rPr>
+          <w:i/>
           <w:iCs/>
-          <w:i/>
         </w:rPr>
         <w:t xml:space="preserve">Hydrological Processes</w:t>
       </w:r>
@@ -31214,8 +30998,8 @@
       </w:r>
       <w:r>
         <w:rPr>
+          <w:i/>
           <w:iCs/>
-          <w:i/>
         </w:rPr>
         <w:t xml:space="preserve">International Journal of Climatology</w:t>
       </w:r>
@@ -31266,8 +31050,8 @@
       </w:r>
       <w:r>
         <w:rPr>
+          <w:i/>
           <w:iCs/>
-          <w:i/>
         </w:rPr>
         <w:t xml:space="preserve">Water Resources Management</w:t>
       </w:r>
@@ -31318,8 +31102,8 @@
       </w:r>
       <w:r>
         <w:rPr>
+          <w:i/>
           <w:iCs/>
-          <w:i/>
         </w:rPr>
         <w:t xml:space="preserve">International Journal of Climatology</w:t>
       </w:r>
@@ -31370,8 +31154,8 @@
       </w:r>
       <w:r>
         <w:rPr>
+          <w:i/>
           <w:iCs/>
-          <w:i/>
         </w:rPr>
         <w:t xml:space="preserve">Journal of Hydrology</w:t>
       </w:r>
@@ -31430,14 +31214,14 @@
 <file path=word/numbering.xml><?xml version="1.0" encoding="utf-8"?>
 <w:numbering xmlns:w="http://schemas.openxmlformats.org/wordprocessingml/2006/main">
   <w:abstractNum w:abstractNumId="990">
-    <w:nsid w:val="A990"/>
+    <w:nsid w:val="0000A990"/>
     <w:multiLevelType w:val="multilevel"/>
     <w:lvl w:ilvl="0">
       <w:numFmt w:val="bullet"/>
       <w:lvlText w:val=" "/>
       <w:lvlJc w:val="left"/>
       <w:pPr>
-        <w:ind w:left="720" w:hanging="480"/>
+        <w:ind w:left="720" w:hanging="360"/>
       </w:pPr>
     </w:lvl>
     <w:lvl w:ilvl="1">
@@ -31445,7 +31229,7 @@
       <w:lvlText w:val=" "/>
       <w:lvlJc w:val="left"/>
       <w:pPr>
-        <w:ind w:left="1440" w:hanging="480"/>
+        <w:ind w:left="1440" w:hanging="360"/>
       </w:pPr>
     </w:lvl>
     <w:lvl w:ilvl="2">
@@ -31453,7 +31237,7 @@
       <w:lvlText w:val=" "/>
       <w:lvlJc w:val="left"/>
       <w:pPr>
-        <w:ind w:left="2160" w:hanging="480"/>
+        <w:ind w:left="2160" w:hanging="360"/>
       </w:pPr>
     </w:lvl>
     <w:lvl w:ilvl="3">
@@ -31461,7 +31245,7 @@
       <w:lvlText w:val=" "/>
       <w:lvlJc w:val="left"/>
       <w:pPr>
-        <w:ind w:left="2880" w:hanging="480"/>
+        <w:ind w:left="2880" w:hanging="360"/>
       </w:pPr>
     </w:lvl>
     <w:lvl w:ilvl="4">
@@ -31469,7 +31253,7 @@
       <w:lvlText w:val=" "/>
       <w:lvlJc w:val="left"/>
       <w:pPr>
-        <w:ind w:left="3600" w:hanging="480"/>
+        <w:ind w:left="3600" w:hanging="360"/>
       </w:pPr>
     </w:lvl>
     <w:lvl w:ilvl="5">
@@ -31477,7 +31261,7 @@
       <w:lvlText w:val=" "/>
       <w:lvlJc w:val="left"/>
       <w:pPr>
-        <w:ind w:left="4320" w:hanging="480"/>
+        <w:ind w:left="4320" w:hanging="360"/>
       </w:pPr>
     </w:lvl>
     <w:lvl w:ilvl="6">
@@ -31485,7 +31269,7 @@
       <w:lvlText w:val=" "/>
       <w:lvlJc w:val="left"/>
       <w:pPr>
-        <w:ind w:left="5040" w:hanging="480"/>
+        <w:ind w:left="5040" w:hanging="360"/>
       </w:pPr>
     </w:lvl>
     <w:lvl w:ilvl="7">
@@ -31493,7 +31277,7 @@
       <w:lvlText w:val=" "/>
       <w:lvlJc w:val="left"/>
       <w:pPr>
-        <w:ind w:left="5760" w:hanging="480"/>
+        <w:ind w:left="5760" w:hanging="360"/>
       </w:pPr>
     </w:lvl>
     <w:lvl w:ilvl="8">
@@ -31501,88 +31285,115 @@
       <w:lvlText w:val=" "/>
       <w:lvlJc w:val="left"/>
       <w:pPr>
-        <w:ind w:left="6480" w:hanging="480"/>
+        <w:ind w:left="6480" w:hanging="360"/>
       </w:pPr>
     </w:lvl>
   </w:abstractNum>
   <w:abstractNum w:abstractNumId="991">
-    <w:nsid w:val="A991"/>
+    <w:nsid w:val="0000A991"/>
     <w:multiLevelType w:val="multilevel"/>
     <w:lvl w:ilvl="0">
       <w:numFmt w:val="bullet"/>
-      <w:lvlText w:val="•"/>
+      <w:lvlText w:val=""/>
       <w:lvlJc w:val="left"/>
       <w:pPr>
-        <w:ind w:left="720" w:hanging="480"/>
+        <w:ind w:left="720" w:hanging="360"/>
       </w:pPr>
+      <w:rPr>
+        <w:rFonts w:ascii="Symbol" w:hAnsi="Symbol" w:cs="Symbol" w:hint="default"/>
+      </w:rPr>
     </w:lvl>
     <w:lvl w:ilvl="1">
       <w:numFmt w:val="bullet"/>
-      <w:lvlText w:val="–"/>
+      <w:lvlText w:val="o"/>
       <w:lvlJc w:val="left"/>
       <w:pPr>
-        <w:ind w:left="1440" w:hanging="480"/>
+        <w:ind w:left="1440" w:hanging="360"/>
       </w:pPr>
+      <w:rPr>
+        <w:rFonts w:ascii="Courier New" w:hAnsi="Courier New" w:cs="Courier New" w:hint="default"/>
+      </w:rPr>
     </w:lvl>
     <w:lvl w:ilvl="2">
       <w:numFmt w:val="bullet"/>
-      <w:lvlText w:val="•"/>
+      <w:lvlText w:val=""/>
       <w:lvlJc w:val="left"/>
       <w:pPr>
-        <w:ind w:left="2160" w:hanging="480"/>
+        <w:ind w:left="2160" w:hanging="360"/>
       </w:pPr>
+      <w:rPr>
+        <w:rFonts w:ascii="Wingdings" w:hAnsi="Wingdings" w:cs="Wingdings" w:hint="default"/>
+      </w:rPr>
     </w:lvl>
     <w:lvl w:ilvl="3">
       <w:numFmt w:val="bullet"/>
-      <w:lvlText w:val="–"/>
+      <w:lvlText w:val=""/>
       <w:lvlJc w:val="left"/>
       <w:pPr>
-        <w:ind w:left="2880" w:hanging="480"/>
+        <w:ind w:left="2880" w:hanging="360"/>
       </w:pPr>
+      <w:rPr>
+        <w:rFonts w:ascii="Symbol" w:hAnsi="Symbol" w:cs="Symbol" w:hint="default"/>
+      </w:rPr>
     </w:lvl>
     <w:lvl w:ilvl="4">
       <w:numFmt w:val="bullet"/>
-      <w:lvlText w:val="•"/>
+      <w:lvlText w:val="o"/>
       <w:lvlJc w:val="left"/>
       <w:pPr>
-        <w:ind w:left="3600" w:hanging="480"/>
+        <w:ind w:left="3600" w:hanging="360"/>
       </w:pPr>
+      <w:rPr>
+        <w:rFonts w:ascii="Courier New" w:hAnsi="Courier New" w:cs="Courier New" w:hint="default"/>
+      </w:rPr>
     </w:lvl>
     <w:lvl w:ilvl="5">
       <w:numFmt w:val="bullet"/>
-      <w:lvlText w:val="–"/>
+      <w:lvlText w:val=""/>
       <w:lvlJc w:val="left"/>
       <w:pPr>
-        <w:ind w:left="4320" w:hanging="480"/>
+        <w:ind w:left="4320" w:hanging="360"/>
       </w:pPr>
+      <w:rPr>
+        <w:rFonts w:ascii="Wingdings" w:hAnsi="Wingdings" w:cs="Wingdings" w:hint="default"/>
+      </w:rPr>
     </w:lvl>
     <w:lvl w:ilvl="6">
       <w:numFmt w:val="bullet"/>
-      <w:lvlText w:val="•"/>
+      <w:lvlText w:val=""/>
       <w:lvlJc w:val="left"/>
       <w:pPr>
-        <w:ind w:left="5040" w:hanging="480"/>
+        <w:ind w:left="5040" w:hanging="360"/>
       </w:pPr>
+      <w:rPr>
+        <w:rFonts w:ascii="Symbol" w:hAnsi="Symbol" w:cs="Symbol" w:hint="default"/>
+      </w:rPr>
     </w:lvl>
     <w:lvl w:ilvl="7">
       <w:numFmt w:val="bullet"/>
-      <w:lvlText w:val="–"/>
+      <w:lvlText w:val="o"/>
       <w:lvlJc w:val="left"/>
       <w:pPr>
-        <w:ind w:left="5760" w:hanging="480"/>
+        <w:ind w:left="5760" w:hanging="360"/>
       </w:pPr>
+      <w:rPr>
+        <w:rFonts w:ascii="Courier New" w:hAnsi="Courier New" w:cs="Courier New" w:hint="default"/>
+      </w:rPr>
     </w:lvl>
     <w:lvl w:ilvl="8">
       <w:numFmt w:val="bullet"/>
-      <w:lvlText w:val="•"/>
+      <w:lvlText w:val=""/>
       <w:lvlJc w:val="left"/>
       <w:pPr>
-        <w:ind w:left="6480" w:hanging="480"/>
+        <w:ind w:left="6480" w:hanging="360"/>
       </w:pPr>
+      <w:rPr>
+        <w:rFonts w:ascii="Wingdings" w:hAnsi="Wingdings" w:cs="Wingdings" w:hint="default"/>
+      </w:rPr>
     </w:lvl>
   </w:abstractNum>
   <w:abstractNum w:abstractNumId="99414">
-    <w:nsid w:val="A99414"/>
+    <w:nsid w:val="00A99414"/>
     <w:multiLevelType w:val="multilevel"/>
     <w:lvl w:ilvl="0">
       <w:start w:val="4"/>
@@ -31590,7 +31401,7 @@
       <w:lvlText w:val="%1."/>
       <w:lvlJc w:val="left"/>
       <w:pPr>
-        <w:ind w:left="720" w:hanging="480"/>
+        <w:ind w:left="720" w:hanging="360"/>
       </w:pPr>
     </w:lvl>
     <w:lvl w:ilvl="1">
@@ -31599,7 +31410,7 @@
       <w:lvlText w:val="%2."/>
       <w:lvlJc w:val="left"/>
       <w:pPr>
-        <w:ind w:left="1440" w:hanging="480"/>
+        <w:ind w:left="1440" w:hanging="360"/>
       </w:pPr>
     </w:lvl>
     <w:lvl w:ilvl="2">
@@ -31608,7 +31419,7 @@
       <w:lvlText w:val="%3."/>
       <w:lvlJc w:val="left"/>
       <w:pPr>
-        <w:ind w:left="2160" w:hanging="480"/>
+        <w:ind w:left="2160" w:hanging="360"/>
       </w:pPr>
     </w:lvl>
     <w:lvl w:ilvl="3">
@@ -31617,7 +31428,7 @@
       <w:lvlText w:val="%4."/>
       <w:lvlJc w:val="left"/>
       <w:pPr>
-        <w:ind w:left="2880" w:hanging="480"/>
+        <w:ind w:left="2880" w:hanging="360"/>
       </w:pPr>
     </w:lvl>
     <w:lvl w:ilvl="4">
@@ -31626,7 +31437,7 @@
       <w:lvlText w:val="%5."/>
       <w:lvlJc w:val="left"/>
       <w:pPr>
-        <w:ind w:left="3600" w:hanging="480"/>
+        <w:ind w:left="3600" w:hanging="360"/>
       </w:pPr>
     </w:lvl>
     <w:lvl w:ilvl="5">
@@ -31635,7 +31446,7 @@
       <w:lvlText w:val="%6."/>
       <w:lvlJc w:val="left"/>
       <w:pPr>
-        <w:ind w:left="4320" w:hanging="480"/>
+        <w:ind w:left="4320" w:hanging="360"/>
       </w:pPr>
     </w:lvl>
     <w:lvl w:ilvl="6">
@@ -31644,7 +31455,7 @@
       <w:lvlText w:val="%7."/>
       <w:lvlJc w:val="left"/>
       <w:pPr>
-        <w:ind w:left="5040" w:hanging="480"/>
+        <w:ind w:left="5040" w:hanging="360"/>
       </w:pPr>
     </w:lvl>
     <w:lvl w:ilvl="7">
@@ -31653,7 +31464,7 @@
       <w:lvlText w:val="%8."/>
       <w:lvlJc w:val="left"/>
       <w:pPr>
-        <w:ind w:left="5760" w:hanging="480"/>
+        <w:ind w:left="5760" w:hanging="360"/>
       </w:pPr>
     </w:lvl>
     <w:lvl w:ilvl="8">
@@ -31662,12 +31473,12 @@
       <w:lvlText w:val="%9."/>
       <w:lvlJc w:val="left"/>
       <w:pPr>
-        <w:ind w:left="6480" w:hanging="480"/>
+        <w:ind w:left="6480" w:hanging="360"/>
       </w:pPr>
     </w:lvl>
   </w:abstractNum>
   <w:abstractNum w:abstractNumId="99415">
-    <w:nsid w:val="A99415"/>
+    <w:nsid w:val="00A99415"/>
     <w:multiLevelType w:val="multilevel"/>
     <w:lvl w:ilvl="0">
       <w:start w:val="5"/>
@@ -31675,7 +31486,7 @@
       <w:lvlText w:val="%1."/>
       <w:lvlJc w:val="left"/>
       <w:pPr>
-        <w:ind w:left="720" w:hanging="480"/>
+        <w:ind w:left="720" w:hanging="360"/>
       </w:pPr>
     </w:lvl>
     <w:lvl w:ilvl="1">
@@ -31684,7 +31495,7 @@
       <w:lvlText w:val="%2."/>
       <w:lvlJc w:val="left"/>
       <w:pPr>
-        <w:ind w:left="1440" w:hanging="480"/>
+        <w:ind w:left="1440" w:hanging="360"/>
       </w:pPr>
     </w:lvl>
     <w:lvl w:ilvl="2">
@@ -31693,7 +31504,7 @@
       <w:lvlText w:val="%3."/>
       <w:lvlJc w:val="left"/>
       <w:pPr>
-        <w:ind w:left="2160" w:hanging="480"/>
+        <w:ind w:left="2160" w:hanging="360"/>
       </w:pPr>
     </w:lvl>
     <w:lvl w:ilvl="3">
@@ -31702,7 +31513,7 @@
       <w:lvlText w:val="%4."/>
       <w:lvlJc w:val="left"/>
       <w:pPr>
-        <w:ind w:left="2880" w:hanging="480"/>
+        <w:ind w:left="2880" w:hanging="360"/>
       </w:pPr>
     </w:lvl>
     <w:lvl w:ilvl="4">
@@ -31711,7 +31522,7 @@
       <w:lvlText w:val="%5."/>
       <w:lvlJc w:val="left"/>
       <w:pPr>
-        <w:ind w:left="3600" w:hanging="480"/>
+        <w:ind w:left="3600" w:hanging="360"/>
       </w:pPr>
     </w:lvl>
     <w:lvl w:ilvl="5">
@@ -31720,7 +31531,7 @@
       <w:lvlText w:val="%6."/>
       <w:lvlJc w:val="left"/>
       <w:pPr>
-        <w:ind w:left="4320" w:hanging="480"/>
+        <w:ind w:left="4320" w:hanging="360"/>
       </w:pPr>
     </w:lvl>
     <w:lvl w:ilvl="6">
@@ -31729,7 +31540,7 @@
       <w:lvlText w:val="%7."/>
       <w:lvlJc w:val="left"/>
       <w:pPr>
-        <w:ind w:left="5040" w:hanging="480"/>
+        <w:ind w:left="5040" w:hanging="360"/>
       </w:pPr>
     </w:lvl>
     <w:lvl w:ilvl="7">
@@ -31738,7 +31549,7 @@
       <w:lvlText w:val="%8."/>
       <w:lvlJc w:val="left"/>
       <w:pPr>
-        <w:ind w:left="5760" w:hanging="480"/>
+        <w:ind w:left="5760" w:hanging="360"/>
       </w:pPr>
     </w:lvl>
     <w:lvl w:ilvl="8">
@@ -31747,7 +31558,7 @@
       <w:lvlText w:val="%9."/>
       <w:lvlJc w:val="left"/>
       <w:pPr>
-        <w:ind w:left="6480" w:hanging="480"/>
+        <w:ind w:left="6480" w:hanging="360"/>
       </w:pPr>
     </w:lvl>
   </w:abstractNum>
@@ -31846,10 +31657,10 @@
     <w:name w:val="Body Text"/>
     <w:basedOn w:val="Normal"/>
     <w:link w:val="BodyTextChar"/>
+    <w:qFormat/>
     <w:pPr>
       <w:spacing w:after="180" w:before="180"/>
     </w:pPr>
-    <w:qFormat/>
   </w:style>
   <w:style w:customStyle="1" w:styleId="FirstParagraph" w:type="paragraph">
     <w:name w:val="First Paragraph"/>
@@ -31869,36 +31680,69 @@
     <w:name w:val="Title"/>
     <w:basedOn w:val="Normal"/>
     <w:next w:val="BodyText"/>
+    <w:link w:val="TitleChar"/>
+    <w:uiPriority w:val="10"/>
     <w:qFormat/>
+    <w:rsid w:val="00A10FD9"/>
     <w:pPr>
-      <w:keepNext/>
-      <w:keepLines/>
-      <w:spacing w:after="240" w:before="480"/>
+      <w:spacing w:after="80" w:line="240" w:lineRule="auto"/>
+      <w:contextualSpacing/>
       <w:jc w:val="center"/>
     </w:pPr>
     <w:rPr>
       <w:rFonts w:asciiTheme="majorHAnsi" w:cstheme="majorBidi" w:eastAsiaTheme="majorEastAsia" w:hAnsiTheme="majorHAnsi"/>
-      <w:b/>
-      <w:bCs/>
-      <w:color w:themeColor="accent1" w:themeShade="B5" w:val="345A8A"/>
-      <w:sz w:val="36"/>
-      <w:szCs w:val="36"/>
+      <w:spacing w:val="-10"/>
+      <w:kern w:val="28"/>
+      <w:sz w:val="56"/>
+      <w:szCs w:val="56"/>
+    </w:rPr>
+  </w:style>
+  <w:style w:customStyle="1" w:styleId="TitleChar" w:type="character">
+    <w:name w:val="Title Char"/>
+    <w:basedOn w:val="DefaultParagraphFont"/>
+    <w:link w:val="Title"/>
+    <w:uiPriority w:val="10"/>
+    <w:rsid w:val="00A10FD9"/>
+    <w:rPr>
+      <w:rFonts w:asciiTheme="majorHAnsi" w:cstheme="majorBidi" w:eastAsiaTheme="majorEastAsia" w:hAnsiTheme="majorHAnsi"/>
+      <w:spacing w:val="-10"/>
+      <w:kern w:val="28"/>
+      <w:sz w:val="56"/>
+      <w:szCs w:val="56"/>
     </w:rPr>
   </w:style>
   <w:style w:styleId="Subtitle" w:type="paragraph">
     <w:name w:val="Subtitle"/>
     <w:basedOn w:val="Title"/>
     <w:next w:val="BodyText"/>
+    <w:link w:val="SubtitleChar"/>
+    <w:uiPriority w:val="11"/>
     <w:qFormat/>
+    <w:rsid w:val="00A10FD9"/>
     <w:pPr>
-      <w:keepNext/>
-      <w:keepLines/>
-      <w:spacing w:after="240" w:before="240"/>
-      <w:jc w:val="center"/>
+      <w:numPr>
+        <w:ilvl w:val="1"/>
+      </w:numPr>
     </w:pPr>
     <w:rPr>
-      <w:sz w:val="30"/>
-      <w:szCs w:val="30"/>
+      <w:rFonts w:cstheme="majorBidi" w:eastAsiaTheme="majorEastAsia"/>
+      <w:spacing w:val="15"/>
+      <w:sz w:val="28"/>
+      <w:szCs w:val="28"/>
+    </w:rPr>
+  </w:style>
+  <w:style w:customStyle="1" w:styleId="SubtitleChar" w:type="character">
+    <w:name w:val="Subtitle Char"/>
+    <w:basedOn w:val="DefaultParagraphFont"/>
+    <w:link w:val="Subtitle"/>
+    <w:uiPriority w:val="11"/>
+    <w:rsid w:val="00A10FD9"/>
+    <w:rPr>
+      <w:rFonts w:cstheme="majorBidi" w:eastAsiaTheme="majorEastAsia"/>
+      <w:color w:themeColor="text1" w:themeTint="A6" w:val="595959"/>
+      <w:spacing w:val="15"/>
+      <w:sz w:val="28"/>
+      <w:szCs w:val="28"/>
     </w:rPr>
   </w:style>
   <w:style w:customStyle="1" w:styleId="Author" w:type="paragraph">
@@ -31929,15 +31773,13 @@
     <w:pPr>
       <w:keepNext/>
       <w:keepLines/>
+      <w:spacing w:after="0" w:before="300"/>
       <w:jc w:val="center"/>
-      <w:spacing w:after="0" w:before="300"/>
     </w:pPr>
     <w:rPr>
+      <w:b/>
       <w:sz w:val="20"/>
       <w:szCs w:val="20"/>
-      <w:b/>
-      <w:color w:val="345A8A"/>
-      &gt;
     </w:rPr>
   </w:style>
   <w:style w:customStyle="1" w:styleId="Abstract" w:type="paragraph">
@@ -31964,191 +31806,321 @@
     <w:rPr/>
   </w:style>
   <w:style w:styleId="Heading1" w:type="paragraph">
-    <w:name w:val="Heading 1"/>
+    <w:name w:val="heading 1"/>
     <w:basedOn w:val="Normal"/>
     <w:next w:val="BodyText"/>
+    <w:link w:val="Heading1Char"/>
     <w:uiPriority w:val="9"/>
     <w:qFormat/>
+    <w:rsid w:val="00A10FD9"/>
     <w:pPr>
       <w:keepNext/>
       <w:keepLines/>
-      <w:spacing w:after="0" w:before="480"/>
+      <w:spacing w:after="80" w:before="360"/>
       <w:outlineLvl w:val="0"/>
     </w:pPr>
     <w:rPr>
       <w:rFonts w:asciiTheme="majorHAnsi" w:cstheme="majorBidi" w:eastAsiaTheme="majorEastAsia" w:hAnsiTheme="majorHAnsi"/>
-      <w:b/>
-      <w:bCs/>
-      <w:color w:themeColor="accent1" w:val="4F81BD"/>
+      <w:color w:themeColor="accent1" w:themeShade="BF" w:val="0F4761"/>
+      <w:sz w:val="40"/>
+      <w:szCs w:val="40"/>
+    </w:rPr>
+  </w:style>
+  <w:style w:styleId="Heading2" w:type="paragraph">
+    <w:name w:val="heading 2"/>
+    <w:basedOn w:val="Normal"/>
+    <w:next w:val="BodyText"/>
+    <w:link w:val="Heading2Char"/>
+    <w:uiPriority w:val="9"/>
+    <w:semiHidden/>
+    <w:unhideWhenUsed/>
+    <w:qFormat/>
+    <w:rsid w:val="00A10FD9"/>
+    <w:pPr>
+      <w:keepNext/>
+      <w:keepLines/>
+      <w:spacing w:after="80" w:before="160"/>
+      <w:outlineLvl w:val="1"/>
+    </w:pPr>
+    <w:rPr>
+      <w:rFonts w:asciiTheme="majorHAnsi" w:cstheme="majorBidi" w:eastAsiaTheme="majorEastAsia" w:hAnsiTheme="majorHAnsi"/>
+      <w:color w:themeColor="accent1" w:themeShade="BF" w:val="0F4761"/>
       <w:sz w:val="32"/>
       <w:szCs w:val="32"/>
     </w:rPr>
   </w:style>
-  <w:style w:styleId="Heading2" w:type="paragraph">
-    <w:name w:val="Heading 2"/>
+  <w:style w:styleId="Heading3" w:type="paragraph">
+    <w:name w:val="heading 3"/>
     <w:basedOn w:val="Normal"/>
     <w:next w:val="BodyText"/>
+    <w:link w:val="Heading3Char"/>
     <w:uiPriority w:val="9"/>
+    <w:semiHidden/>
     <w:unhideWhenUsed/>
     <w:qFormat/>
+    <w:rsid w:val="00A10FD9"/>
     <w:pPr>
       <w:keepNext/>
       <w:keepLines/>
-      <w:spacing w:after="0" w:before="200"/>
-      <w:outlineLvl w:val="1"/>
+      <w:spacing w:after="80" w:before="160"/>
+      <w:outlineLvl w:val="2"/>
     </w:pPr>
     <w:rPr>
-      <w:rFonts w:asciiTheme="majorHAnsi" w:cstheme="majorBidi" w:eastAsiaTheme="majorEastAsia" w:hAnsiTheme="majorHAnsi"/>
-      <w:b/>
-      <w:bCs/>
-      <w:color w:themeColor="accent1" w:val="4F81BD"/>
+      <w:rFonts w:cstheme="majorBidi" w:eastAsiaTheme="majorEastAsia"/>
+      <w:color w:themeColor="accent1" w:themeShade="BF" w:val="0F4761"/>
       <w:sz w:val="28"/>
       <w:szCs w:val="28"/>
     </w:rPr>
   </w:style>
-  <w:style w:styleId="Heading3" w:type="paragraph">
-    <w:name w:val="Heading 3"/>
+  <w:style w:styleId="Heading4" w:type="paragraph">
+    <w:name w:val="heading 4"/>
     <w:basedOn w:val="Normal"/>
     <w:next w:val="BodyText"/>
+    <w:link w:val="Heading4Char"/>
     <w:uiPriority w:val="9"/>
+    <w:semiHidden/>
     <w:unhideWhenUsed/>
     <w:qFormat/>
+    <w:rsid w:val="00A10FD9"/>
     <w:pPr>
       <w:keepNext/>
       <w:keepLines/>
-      <w:spacing w:after="0" w:before="200"/>
-      <w:outlineLvl w:val="2"/>
+      <w:spacing w:after="40" w:before="80"/>
+      <w:outlineLvl w:val="3"/>
     </w:pPr>
     <w:rPr>
-      <w:rFonts w:asciiTheme="majorHAnsi" w:cstheme="majorBidi" w:eastAsiaTheme="majorEastAsia" w:hAnsiTheme="majorHAnsi"/>
-      <w:b/>
-      <w:bCs/>
-      <w:color w:themeColor="accent1" w:val="4F81BD"/>
-      <w:sz w:val="24"/>
-      <w:szCs w:val="24"/>
+      <w:rFonts w:cstheme="majorBidi" w:eastAsiaTheme="majorEastAsia"/>
+      <w:i/>
+      <w:iCs/>
+      <w:color w:themeColor="accent1" w:themeShade="BF" w:val="0F4761"/>
     </w:rPr>
   </w:style>
-  <w:style w:styleId="Heading4" w:type="paragraph">
-    <w:name w:val="Heading 4"/>
+  <w:style w:styleId="Heading5" w:type="paragraph">
+    <w:name w:val="heading 5"/>
     <w:basedOn w:val="Normal"/>
     <w:next w:val="BodyText"/>
+    <w:link w:val="Heading5Char"/>
     <w:uiPriority w:val="9"/>
+    <w:semiHidden/>
     <w:unhideWhenUsed/>
     <w:qFormat/>
+    <w:rsid w:val="00A10FD9"/>
     <w:pPr>
       <w:keepNext/>
       <w:keepLines/>
-      <w:spacing w:after="0" w:before="200"/>
-      <w:outlineLvl w:val="3"/>
+      <w:spacing w:after="40" w:before="80"/>
+      <w:outlineLvl w:val="4"/>
     </w:pPr>
     <w:rPr>
-      <w:rFonts w:asciiTheme="majorHAnsi" w:cstheme="majorBidi" w:eastAsiaTheme="majorEastAsia" w:hAnsiTheme="majorHAnsi"/>
-      <w:i/>
-      <w:bCs/>
-      <w:color w:themeColor="accent1" w:val="4F81BD"/>
-      <w:sz w:val="24"/>
-      <w:szCs w:val="24"/>
+      <w:rFonts w:cstheme="majorBidi" w:eastAsiaTheme="majorEastAsia"/>
+      <w:color w:themeColor="accent1" w:themeShade="BF" w:val="0F4761"/>
     </w:rPr>
   </w:style>
-  <w:style w:styleId="Heading5" w:type="paragraph">
-    <w:name w:val="Heading 5"/>
+  <w:style w:styleId="Heading6" w:type="paragraph">
+    <w:name w:val="heading 6"/>
     <w:basedOn w:val="Normal"/>
     <w:next w:val="BodyText"/>
+    <w:link w:val="Heading6Char"/>
     <w:uiPriority w:val="9"/>
+    <w:semiHidden/>
     <w:unhideWhenUsed/>
     <w:qFormat/>
+    <w:rsid w:val="00A10FD9"/>
     <w:pPr>
       <w:keepNext/>
       <w:keepLines/>
-      <w:spacing w:after="0" w:before="200"/>
-      <w:outlineLvl w:val="4"/>
+      <w:spacing w:after="0" w:before="40"/>
+      <w:outlineLvl w:val="5"/>
     </w:pPr>
     <w:rPr>
-      <w:rFonts w:asciiTheme="majorHAnsi" w:cstheme="majorBidi" w:eastAsiaTheme="majorEastAsia" w:hAnsiTheme="majorHAnsi"/>
+      <w:rFonts w:cstheme="majorBidi" w:eastAsiaTheme="majorEastAsia"/>
+      <w:i/>
       <w:iCs/>
-      <w:color w:themeColor="accent1" w:val="4F81BD"/>
-      <w:sz w:val="24"/>
-      <w:szCs w:val="24"/>
+      <w:color w:themeColor="text1" w:themeTint="A6" w:val="595959"/>
     </w:rPr>
   </w:style>
-  <w:style w:styleId="Heading6" w:type="paragraph">
-    <w:name w:val="Heading 6"/>
+  <w:style w:styleId="Heading7" w:type="paragraph">
+    <w:name w:val="heading 7"/>
     <w:basedOn w:val="Normal"/>
     <w:next w:val="BodyText"/>
+    <w:link w:val="Heading7Char"/>
     <w:uiPriority w:val="9"/>
+    <w:semiHidden/>
     <w:unhideWhenUsed/>
     <w:qFormat/>
+    <w:rsid w:val="00A10FD9"/>
     <w:pPr>
       <w:keepNext/>
       <w:keepLines/>
-      <w:spacing w:after="0" w:before="200"/>
-      <w:outlineLvl w:val="5"/>
+      <w:spacing w:after="0" w:before="40"/>
+      <w:outlineLvl w:val="6"/>
     </w:pPr>
     <w:rPr>
-      <w:rFonts w:asciiTheme="majorHAnsi" w:cstheme="majorBidi" w:eastAsiaTheme="majorEastAsia" w:hAnsiTheme="majorHAnsi"/>
-      <w:color w:themeColor="accent1" w:val="4F81BD"/>
-      <w:sz w:val="24"/>
-      <w:szCs w:val="24"/>
+      <w:rFonts w:cstheme="majorBidi" w:eastAsiaTheme="majorEastAsia"/>
+      <w:color w:themeColor="text1" w:themeTint="A6" w:val="595959"/>
     </w:rPr>
   </w:style>
-  <w:style w:styleId="Heading7" w:type="paragraph">
-    <w:name w:val="Heading 7"/>
+  <w:style w:styleId="Heading8" w:type="paragraph">
+    <w:name w:val="heading 8"/>
     <w:basedOn w:val="Normal"/>
     <w:next w:val="BodyText"/>
+    <w:link w:val="Heading8Char"/>
     <w:uiPriority w:val="9"/>
+    <w:semiHidden/>
     <w:unhideWhenUsed/>
     <w:qFormat/>
+    <w:rsid w:val="00A10FD9"/>
     <w:pPr>
       <w:keepNext/>
       <w:keepLines/>
-      <w:spacing w:after="0" w:before="200"/>
-      <w:outlineLvl w:val="6"/>
+      <w:spacing w:after="0"/>
+      <w:outlineLvl w:val="7"/>
     </w:pPr>
     <w:rPr>
-      <w:rFonts w:asciiTheme="majorHAnsi" w:cstheme="majorBidi" w:eastAsiaTheme="majorEastAsia" w:hAnsiTheme="majorHAnsi"/>
-      <w:color w:themeColor="accent1" w:val="4F81BD"/>
-      <w:sz w:val="24"/>
-      <w:szCs w:val="24"/>
+      <w:rFonts w:cstheme="majorBidi" w:eastAsiaTheme="majorEastAsia"/>
+      <w:i/>
+      <w:iCs/>
+      <w:color w:themeColor="text1" w:themeTint="D8" w:val="272727"/>
     </w:rPr>
   </w:style>
-  <w:style w:styleId="Heading8" w:type="paragraph">
-    <w:name w:val="Heading 8"/>
+  <w:style w:styleId="Heading9" w:type="paragraph">
+    <w:name w:val="heading 9"/>
     <w:basedOn w:val="Normal"/>
     <w:next w:val="BodyText"/>
+    <w:link w:val="Heading9Char"/>
     <w:uiPriority w:val="9"/>
+    <w:semiHidden/>
     <w:unhideWhenUsed/>
     <w:qFormat/>
+    <w:rsid w:val="00A10FD9"/>
     <w:pPr>
       <w:keepNext/>
       <w:keepLines/>
-      <w:spacing w:after="0" w:before="200"/>
-      <w:outlineLvl w:val="7"/>
-    </w:pPr>
-    <w:rPr>
-      <w:rFonts w:asciiTheme="majorHAnsi" w:cstheme="majorBidi" w:eastAsiaTheme="majorEastAsia" w:hAnsiTheme="majorHAnsi"/>
-      <w:color w:themeColor="accent1" w:val="4F81BD"/>
-      <w:sz w:val="24"/>
-      <w:szCs w:val="24"/>
-    </w:rPr>
-  </w:style>
-  <w:style w:styleId="Heading9" w:type="paragraph">
-    <w:name w:val="Heading 9"/>
-    <w:basedOn w:val="Normal"/>
-    <w:next w:val="BodyText"/>
-    <w:uiPriority w:val="9"/>
-    <w:unhideWhenUsed/>
-    <w:qFormat/>
-    <w:pPr>
-      <w:keepNext/>
-      <w:keepLines/>
-      <w:spacing w:after="0" w:before="200"/>
+      <w:spacing w:after="0"/>
       <w:outlineLvl w:val="8"/>
     </w:pPr>
     <w:rPr>
+      <w:rFonts w:cstheme="majorBidi" w:eastAsiaTheme="majorEastAsia"/>
+      <w:color w:themeColor="text1" w:themeTint="D8" w:val="272727"/>
+    </w:rPr>
+  </w:style>
+  <w:style w:customStyle="1" w:styleId="Heading1Char" w:type="character">
+    <w:name w:val="Heading 1 Char"/>
+    <w:basedOn w:val="DefaultParagraphFont"/>
+    <w:link w:val="Heading1"/>
+    <w:uiPriority w:val="9"/>
+    <w:rsid w:val="00A10FD9"/>
+    <w:rPr>
       <w:rFonts w:asciiTheme="majorHAnsi" w:cstheme="majorBidi" w:eastAsiaTheme="majorEastAsia" w:hAnsiTheme="majorHAnsi"/>
-      <w:color w:themeColor="accent1" w:val="4F81BD"/>
-      <w:sz w:val="24"/>
-      <w:szCs w:val="24"/>
+      <w:color w:themeColor="accent1" w:themeShade="BF" w:val="0F4761"/>
+      <w:sz w:val="40"/>
+      <w:szCs w:val="40"/>
+    </w:rPr>
+  </w:style>
+  <w:style w:customStyle="1" w:styleId="Heading2Char" w:type="character">
+    <w:name w:val="Heading 2 Char"/>
+    <w:basedOn w:val="DefaultParagraphFont"/>
+    <w:link w:val="Heading2"/>
+    <w:uiPriority w:val="9"/>
+    <w:semiHidden/>
+    <w:rsid w:val="00A10FD9"/>
+    <w:rPr>
+      <w:rFonts w:asciiTheme="majorHAnsi" w:cstheme="majorBidi" w:eastAsiaTheme="majorEastAsia" w:hAnsiTheme="majorHAnsi"/>
+      <w:color w:themeColor="accent1" w:themeShade="BF" w:val="0F4761"/>
+      <w:sz w:val="32"/>
+      <w:szCs w:val="32"/>
+    </w:rPr>
+  </w:style>
+  <w:style w:customStyle="1" w:styleId="Heading3Char" w:type="character">
+    <w:name w:val="Heading 3 Char"/>
+    <w:basedOn w:val="DefaultParagraphFont"/>
+    <w:link w:val="Heading3"/>
+    <w:uiPriority w:val="9"/>
+    <w:semiHidden/>
+    <w:rsid w:val="00A10FD9"/>
+    <w:rPr>
+      <w:rFonts w:cstheme="majorBidi" w:eastAsiaTheme="majorEastAsia"/>
+      <w:color w:themeColor="accent1" w:themeShade="BF" w:val="0F4761"/>
+      <w:sz w:val="28"/>
+      <w:szCs w:val="28"/>
+    </w:rPr>
+  </w:style>
+  <w:style w:customStyle="1" w:styleId="Heading4Char" w:type="character">
+    <w:name w:val="Heading 4 Char"/>
+    <w:basedOn w:val="DefaultParagraphFont"/>
+    <w:link w:val="Heading4"/>
+    <w:uiPriority w:val="9"/>
+    <w:semiHidden/>
+    <w:rsid w:val="00A10FD9"/>
+    <w:rPr>
+      <w:rFonts w:cstheme="majorBidi" w:eastAsiaTheme="majorEastAsia"/>
+      <w:i/>
+      <w:iCs/>
+      <w:color w:themeColor="accent1" w:themeShade="BF" w:val="0F4761"/>
+    </w:rPr>
+  </w:style>
+  <w:style w:customStyle="1" w:styleId="Heading5Char" w:type="character">
+    <w:name w:val="Heading 5 Char"/>
+    <w:basedOn w:val="DefaultParagraphFont"/>
+    <w:link w:val="Heading5"/>
+    <w:uiPriority w:val="9"/>
+    <w:semiHidden/>
+    <w:rsid w:val="00A10FD9"/>
+    <w:rPr>
+      <w:rFonts w:cstheme="majorBidi" w:eastAsiaTheme="majorEastAsia"/>
+      <w:color w:themeColor="accent1" w:themeShade="BF" w:val="0F4761"/>
+    </w:rPr>
+  </w:style>
+  <w:style w:customStyle="1" w:styleId="Heading6Char" w:type="character">
+    <w:name w:val="Heading 6 Char"/>
+    <w:basedOn w:val="DefaultParagraphFont"/>
+    <w:link w:val="Heading6"/>
+    <w:uiPriority w:val="9"/>
+    <w:semiHidden/>
+    <w:rsid w:val="00A10FD9"/>
+    <w:rPr>
+      <w:rFonts w:cstheme="majorBidi" w:eastAsiaTheme="majorEastAsia"/>
+      <w:i/>
+      <w:iCs/>
+      <w:color w:themeColor="text1" w:themeTint="A6" w:val="595959"/>
+    </w:rPr>
+  </w:style>
+  <w:style w:customStyle="1" w:styleId="Heading7Char" w:type="character">
+    <w:name w:val="Heading 7 Char"/>
+    <w:basedOn w:val="DefaultParagraphFont"/>
+    <w:link w:val="Heading7"/>
+    <w:uiPriority w:val="9"/>
+    <w:semiHidden/>
+    <w:rsid w:val="00A10FD9"/>
+    <w:rPr>
+      <w:rFonts w:cstheme="majorBidi" w:eastAsiaTheme="majorEastAsia"/>
+      <w:color w:themeColor="text1" w:themeTint="A6" w:val="595959"/>
+    </w:rPr>
+  </w:style>
+  <w:style w:customStyle="1" w:styleId="Heading8Char" w:type="character">
+    <w:name w:val="Heading 8 Char"/>
+    <w:basedOn w:val="DefaultParagraphFont"/>
+    <w:link w:val="Heading8"/>
+    <w:uiPriority w:val="9"/>
+    <w:semiHidden/>
+    <w:rsid w:val="00A10FD9"/>
+    <w:rPr>
+      <w:rFonts w:cstheme="majorBidi" w:eastAsiaTheme="majorEastAsia"/>
+      <w:i/>
+      <w:iCs/>
+      <w:color w:themeColor="text1" w:themeTint="D8" w:val="272727"/>
+    </w:rPr>
+  </w:style>
+  <w:style w:customStyle="1" w:styleId="Heading9Char" w:type="character">
+    <w:name w:val="Heading 9 Char"/>
+    <w:basedOn w:val="DefaultParagraphFont"/>
+    <w:link w:val="Heading9"/>
+    <w:uiPriority w:val="9"/>
+    <w:semiHidden/>
+    <w:rsid w:val="00A10FD9"/>
+    <w:rPr>
+      <w:rFonts w:cstheme="majorBidi" w:eastAsiaTheme="majorEastAsia"/>
+      <w:color w:themeColor="text1" w:themeTint="D8" w:val="272727"/>
     </w:rPr>
   </w:style>
   <w:style w:styleId="BlockText" w:type="paragraph">
@@ -32173,8 +32145,8 @@
   </w:style>
   <w:style w:styleId="FootnoteBlockText" w:type="paragraph">
     <w:name w:val="Footnote Block Text"/>
-    <w:basedOn w:val="Footnote Text"/>
-    <w:next w:val="Footnote Text"/>
+    <w:basedOn w:val="FootnoteText"/>
+    <w:next w:val="FootnoteText"/>
     <w:uiPriority w:val="9"/>
     <w:unhideWhenUsed/>
     <w:qFormat/>
@@ -32212,10 +32184,10 @@
         <w:jc w:val="left"/>
       </w:trPr>
       <w:tcPr>
-        <w:vAlign w:val="bottom"/>
         <w:tcBorders>
           <w:bottom w:val="single"/>
         </w:tcBorders>
+        <w:vAlign w:val="bottom"/>
       </w:tcPr>
     </w:tblStylePr>
   </w:style>
@@ -32331,6 +32303,7 @@
     <w:name w:val="KeywordTok"/>
     <w:basedOn w:val="VerbatimChar"/>
     <w:rPr>
+      <w:b/>
       <w:color w:val="003b4f"/>
       <w:shd w:val="clear" w:fill="f1f3f5"/>
     </w:rPr>
@@ -32435,9 +32408,9 @@
     <w:name w:val="DocumentationTok"/>
     <w:basedOn w:val="VerbatimChar"/>
     <w:rPr>
+      <w:i/>
       <w:color w:val="5e5e5e"/>
       <w:shd w:val="clear" w:fill="f1f3f5"/>
-      <w:i/>
     </w:rPr>
   </w:style>
   <w:style w:type="character" w:customStyle="1" w:styleId="AnnotationTok">
@@ -32452,9 +32425,9 @@
     <w:name w:val="CommentVarTok"/>
     <w:basedOn w:val="VerbatimChar"/>
     <w:rPr>
+      <w:i/>
       <w:color w:val="5e5e5e"/>
       <w:shd w:val="clear" w:fill="f1f3f5"/>
-      <w:i/>
     </w:rPr>
   </w:style>
   <w:style w:type="character" w:customStyle="1" w:styleId="OtherTok">
@@ -32485,6 +32458,7 @@
     <w:name w:val="ControlFlowTok"/>
     <w:basedOn w:val="VerbatimChar"/>
     <w:rPr>
+      <w:b/>
       <w:color w:val="003b4f"/>
       <w:shd w:val="clear" w:fill="f1f3f5"/>
     </w:rPr>
@@ -32549,9 +32523,9 @@
     <w:name w:val="WarningTok"/>
     <w:basedOn w:val="VerbatimChar"/>
     <w:rPr>
+      <w:i/>
       <w:color w:val="5e5e5e"/>
       <w:shd w:val="clear" w:fill="f1f3f5"/>
-      <w:i/>
     </w:rPr>
   </w:style>
   <w:style w:type="character" w:customStyle="1" w:styleId="AlertTok">
@@ -32592,44 +32566,44 @@
         <a:sysClr val="window" lastClr="FFFFFF"/>
       </a:lt1>
       <a:dk2>
-        <a:srgbClr val="1F497D"/>
+        <a:srgbClr val="0E2841"/>
       </a:dk2>
       <a:lt2>
-        <a:srgbClr val="EEECE1"/>
+        <a:srgbClr val="E8E8E8"/>
       </a:lt2>
       <a:accent1>
-        <a:srgbClr val="4F81BD"/>
+        <a:srgbClr val="156082"/>
       </a:accent1>
       <a:accent2>
-        <a:srgbClr val="C0504D"/>
+        <a:srgbClr val="E97132"/>
       </a:accent2>
       <a:accent3>
-        <a:srgbClr val="9BBB59"/>
+        <a:srgbClr val="196B24"/>
       </a:accent3>
       <a:accent4>
-        <a:srgbClr val="8064A2"/>
+        <a:srgbClr val="0F9ED5"/>
       </a:accent4>
       <a:accent5>
-        <a:srgbClr val="4BACC6"/>
+        <a:srgbClr val="A02B93"/>
       </a:accent5>
       <a:accent6>
-        <a:srgbClr val="F79646"/>
+        <a:srgbClr val="4EA72E"/>
       </a:accent6>
       <a:hlink>
-        <a:srgbClr val="0000FF"/>
+        <a:srgbClr val="467886"/>
       </a:hlink>
       <a:folHlink>
-        <a:srgbClr val="800080"/>
+        <a:srgbClr val="96607D"/>
       </a:folHlink>
     </a:clrScheme>
     <a:fontScheme name="Office">
       <a:majorFont>
-        <a:latin typeface="Calibri"/>
+        <a:latin typeface="Aptos Display" panose="02110004020202020204"/>
         <a:ea typeface=""/>
         <a:cs typeface=""/>
-        <a:font script="Jpan" typeface="ＭＳ ゴシック"/>
+        <a:font script="Jpan" typeface="游ゴシック Light"/>
         <a:font script="Hang" typeface="맑은 고딕"/>
-        <a:font script="Hans" typeface="宋体"/>
+        <a:font script="Hans" typeface="等线 Light"/>
         <a:font script="Hant" typeface="新細明體"/>
         <a:font script="Arab" typeface="Times New Roman"/>
         <a:font script="Hebr" typeface="Times New Roman"/>
@@ -32656,14 +32630,32 @@
         <a:font script="Mong" typeface="Mongolian Baiti"/>
         <a:font script="Viet" typeface="Times New Roman"/>
         <a:font script="Uigh" typeface="Microsoft Uighur"/>
+        <a:font script="Geor" typeface="Sylfaen"/>
+        <a:font script="Armn" typeface="Arial"/>
+        <a:font script="Bugi" typeface="Leelawadee UI"/>
+        <a:font script="Bopo" typeface="Microsoft JhengHei"/>
+        <a:font script="Java" typeface="Javanese Text"/>
+        <a:font script="Lisu" typeface="Segoe UI"/>
+        <a:font script="Mymr" typeface="Myanmar Text"/>
+        <a:font script="Nkoo" typeface="Ebrima"/>
+        <a:font script="Olck" typeface="Nirmala UI"/>
+        <a:font script="Osma" typeface="Ebrima"/>
+        <a:font script="Phag" typeface="Phagspa"/>
+        <a:font script="Syrn" typeface="Estrangelo Edessa"/>
+        <a:font script="Syrj" typeface="Estrangelo Edessa"/>
+        <a:font script="Syre" typeface="Estrangelo Edessa"/>
+        <a:font script="Sora" typeface="Nirmala UI"/>
+        <a:font script="Tale" typeface="Microsoft Tai Le"/>
+        <a:font script="Talu" typeface="Microsoft New Tai Lue"/>
+        <a:font script="Tfng" typeface="Ebrima"/>
       </a:majorFont>
       <a:minorFont>
-        <a:latin typeface="Cambria"/>
+        <a:latin typeface="Aptos" panose="02110004020202020204"/>
         <a:ea typeface=""/>
         <a:cs typeface=""/>
-        <a:font script="Jpan" typeface="ＭＳ 明朝"/>
+        <a:font script="Jpan" typeface="游明朝"/>
         <a:font script="Hang" typeface="맑은 고딕"/>
-        <a:font script="Hans" typeface="宋体"/>
+        <a:font script="Hans" typeface="等线"/>
         <a:font script="Hant" typeface="新細明體"/>
         <a:font script="Arab" typeface="Arial"/>
         <a:font script="Hebr" typeface="Arial"/>
@@ -32690,6 +32682,24 @@
         <a:font script="Mong" typeface="Mongolian Baiti"/>
         <a:font script="Viet" typeface="Arial"/>
         <a:font script="Uigh" typeface="Microsoft Uighur"/>
+        <a:font script="Geor" typeface="Sylfaen"/>
+        <a:font script="Armn" typeface="Arial"/>
+        <a:font script="Bugi" typeface="Leelawadee UI"/>
+        <a:font script="Bopo" typeface="Microsoft JhengHei"/>
+        <a:font script="Java" typeface="Javanese Text"/>
+        <a:font script="Lisu" typeface="Segoe UI"/>
+        <a:font script="Mymr" typeface="Myanmar Text"/>
+        <a:font script="Nkoo" typeface="Ebrima"/>
+        <a:font script="Olck" typeface="Nirmala UI"/>
+        <a:font script="Osma" typeface="Ebrima"/>
+        <a:font script="Phag" typeface="Phagspa"/>
+        <a:font script="Syrn" typeface="Estrangelo Edessa"/>
+        <a:font script="Syrj" typeface="Estrangelo Edessa"/>
+        <a:font script="Syre" typeface="Estrangelo Edessa"/>
+        <a:font script="Sora" typeface="Nirmala UI"/>
+        <a:font script="Tale" typeface="Microsoft Tai Le"/>
+        <a:font script="Talu" typeface="Microsoft New Tai Lue"/>
+        <a:font script="Tfng" typeface="Ebrima"/>
       </a:minorFont>
     </a:fontScheme>
     <a:fmtScheme name="Office">
@@ -32701,200 +32711,141 @@
           <a:gsLst>
             <a:gs pos="0">
               <a:schemeClr val="phClr">
-                <a:tint val="50000"/>
-                <a:satMod val="300000"/>
+                <a:lumMod val="110000"/>
+                <a:satMod val="105000"/>
+                <a:tint val="67000"/>
               </a:schemeClr>
             </a:gs>
-            <a:gs pos="35000">
+            <a:gs pos="50000">
               <a:schemeClr val="phClr">
-                <a:tint val="37000"/>
-                <a:satMod val="300000"/>
+                <a:lumMod val="105000"/>
+                <a:satMod val="103000"/>
+                <a:tint val="73000"/>
               </a:schemeClr>
             </a:gs>
             <a:gs pos="100000">
               <a:schemeClr val="phClr">
-                <a:tint val="15000"/>
-                <a:satMod val="350000"/>
+                <a:lumMod val="105000"/>
+                <a:satMod val="109000"/>
+                <a:tint val="81000"/>
               </a:schemeClr>
             </a:gs>
           </a:gsLst>
-          <a:lin ang="16200000" scaled="1"/>
+          <a:lin ang="5400000" scaled="0"/>
         </a:gradFill>
         <a:gradFill rotWithShape="1">
           <a:gsLst>
             <a:gs pos="0">
               <a:schemeClr val="phClr">
-                <a:tint val="100000"/>
+                <a:satMod val="103000"/>
+                <a:lumMod val="102000"/>
+                <a:tint val="94000"/>
+              </a:schemeClr>
+            </a:gs>
+            <a:gs pos="50000">
+              <a:schemeClr val="phClr">
+                <a:satMod val="110000"/>
+                <a:lumMod val="100000"/>
                 <a:shade val="100000"/>
-                <a:satMod val="130000"/>
               </a:schemeClr>
             </a:gs>
             <a:gs pos="100000">
               <a:schemeClr val="phClr">
-                <a:tint val="50000"/>
-                <a:shade val="100000"/>
-                <a:satMod val="350000"/>
+                <a:lumMod val="99000"/>
+                <a:satMod val="120000"/>
+                <a:shade val="78000"/>
               </a:schemeClr>
             </a:gs>
           </a:gsLst>
-          <a:lin ang="16200000" scaled="0"/>
+          <a:lin ang="5400000" scaled="0"/>
         </a:gradFill>
       </a:fillStyleLst>
       <a:lnStyleLst>
-        <a:ln w="9525" cap="flat" cmpd="sng" algn="ctr">
-          <a:solidFill>
-            <a:schemeClr val="phClr">
-              <a:shade val="95000"/>
-              <a:satMod val="105000"/>
-            </a:schemeClr>
-          </a:solidFill>
-          <a:prstDash val="solid"/>
-        </a:ln>
-        <a:ln w="25400" cap="flat" cmpd="sng" algn="ctr">
+        <a:ln w="6350" cap="flat" cmpd="sng" algn="ctr">
           <a:solidFill>
             <a:schemeClr val="phClr"/>
           </a:solidFill>
           <a:prstDash val="solid"/>
+          <a:miter lim="800000"/>
         </a:ln>
-        <a:ln w="38100" cap="flat" cmpd="sng" algn="ctr">
+        <a:ln w="12700" cap="flat" cmpd="sng" algn="ctr">
           <a:solidFill>
             <a:schemeClr val="phClr"/>
           </a:solidFill>
           <a:prstDash val="solid"/>
+          <a:miter lim="800000"/>
+        </a:ln>
+        <a:ln w="19050" cap="flat" cmpd="sng" algn="ctr">
+          <a:solidFill>
+            <a:schemeClr val="phClr"/>
+          </a:solidFill>
+          <a:prstDash val="solid"/>
+          <a:miter lim="800000"/>
         </a:ln>
       </a:lnStyleLst>
       <a:effectStyleLst>
         <a:effectStyle>
+          <a:effectLst/>
+        </a:effectStyle>
+        <a:effectStyle>
+          <a:effectLst/>
+        </a:effectStyle>
+        <a:effectStyle>
           <a:effectLst>
-            <a:outerShdw blurRad="40000" dist="20000" dir="5400000" rotWithShape="0">
+            <a:outerShdw blurRad="57150" dist="19050" dir="5400000" algn="ctr" rotWithShape="0">
               <a:srgbClr val="000000">
-                <a:alpha val="38000"/>
+                <a:alpha val="63000"/>
               </a:srgbClr>
             </a:outerShdw>
           </a:effectLst>
-        </a:effectStyle>
-        <a:effectStyle>
-          <a:effectLst>
-            <a:outerShdw blurRad="40000" dist="23000" dir="5400000" rotWithShape="0">
-              <a:srgbClr val="000000">
-                <a:alpha val="35000"/>
-              </a:srgbClr>
-            </a:outerShdw>
-          </a:effectLst>
-        </a:effectStyle>
-        <a:effectStyle>
-          <a:effectLst>
-            <a:outerShdw blurRad="40000" dist="23000" dir="5400000" rotWithShape="0">
-              <a:srgbClr val="000000">
-                <a:alpha val="35000"/>
-              </a:srgbClr>
-            </a:outerShdw>
-          </a:effectLst>
-          <a:scene3d>
-            <a:camera prst="orthographicFront">
-              <a:rot lat="0" lon="0" rev="0"/>
-            </a:camera>
-            <a:lightRig rig="threePt" dir="t">
-              <a:rot lat="0" lon="0" rev="1200000"/>
-            </a:lightRig>
-          </a:scene3d>
-          <a:sp3d>
-            <a:bevelT w="63500" h="25400"/>
-          </a:sp3d>
         </a:effectStyle>
       </a:effectStyleLst>
       <a:bgFillStyleLst>
         <a:solidFill>
           <a:schemeClr val="phClr"/>
         </a:solidFill>
+        <a:solidFill>
+          <a:schemeClr val="phClr">
+            <a:tint val="95000"/>
+            <a:satMod val="170000"/>
+          </a:schemeClr>
+        </a:solidFill>
         <a:gradFill rotWithShape="1">
           <a:gsLst>
             <a:gs pos="0">
               <a:schemeClr val="phClr">
-                <a:tint val="40000"/>
-                <a:satMod val="350000"/>
+                <a:tint val="93000"/>
+                <a:satMod val="150000"/>
+                <a:shade val="98000"/>
+                <a:lumMod val="102000"/>
               </a:schemeClr>
             </a:gs>
-            <a:gs pos="40000">
+            <a:gs pos="50000">
               <a:schemeClr val="phClr">
-                <a:tint val="45000"/>
-                <a:shade val="99000"/>
-                <a:satMod val="350000"/>
+                <a:tint val="98000"/>
+                <a:satMod val="130000"/>
+                <a:shade val="90000"/>
+                <a:lumMod val="103000"/>
               </a:schemeClr>
             </a:gs>
             <a:gs pos="100000">
               <a:schemeClr val="phClr">
-                <a:shade val="20000"/>
-                <a:satMod val="255000"/>
+                <a:shade val="63000"/>
+                <a:satMod val="120000"/>
               </a:schemeClr>
             </a:gs>
           </a:gsLst>
-          <a:path path="circle">
-            <a:fillToRect l="50000" t="-80000" r="50000" b="180000"/>
-          </a:path>
-        </a:gradFill>
-        <a:gradFill rotWithShape="1">
-          <a:gsLst>
-            <a:gs pos="0">
-              <a:schemeClr val="phClr">
-                <a:tint val="80000"/>
-                <a:satMod val="300000"/>
-              </a:schemeClr>
-            </a:gs>
-            <a:gs pos="100000">
-              <a:schemeClr val="phClr">
-                <a:shade val="30000"/>
-                <a:satMod val="200000"/>
-              </a:schemeClr>
-            </a:gs>
-          </a:gsLst>
-          <a:path path="circle">
-            <a:fillToRect l="50000" t="50000" r="50000" b="50000"/>
-          </a:path>
+          <a:lin ang="5400000" scaled="0"/>
         </a:gradFill>
       </a:bgFillStyleLst>
     </a:fmtScheme>
   </a:themeElements>
-  <a:objectDefaults>
-    <a:spDef>
-      <a:spPr/>
-      <a:bodyPr/>
-      <a:lstStyle/>
-      <a:style>
-        <a:lnRef idx="1">
-          <a:schemeClr val="accent1"/>
-        </a:lnRef>
-        <a:fillRef idx="3">
-          <a:schemeClr val="accent1"/>
-        </a:fillRef>
-        <a:effectRef idx="2">
-          <a:schemeClr val="accent1"/>
-        </a:effectRef>
-        <a:fontRef idx="minor">
-          <a:schemeClr val="lt1"/>
-        </a:fontRef>
-      </a:style>
-    </a:spDef>
-    <a:lnDef>
-      <a:spPr/>
-      <a:bodyPr/>
-      <a:lstStyle/>
-      <a:style>
-        <a:lnRef idx="2">
-          <a:schemeClr val="accent1"/>
-        </a:lnRef>
-        <a:fillRef idx="0">
-          <a:schemeClr val="accent1"/>
-        </a:fillRef>
-        <a:effectRef idx="1">
-          <a:schemeClr val="accent1"/>
-        </a:effectRef>
-        <a:fontRef idx="minor">
-          <a:schemeClr val="tx1"/>
-        </a:fontRef>
-      </a:style>
-    </a:lnDef>
-  </a:objectDefaults>
+  <a:objectDefaults/>
   <a:extraClrSchemeLst/>
+  <a:extLst>
+    <a:ext uri="{05A4C25C-085E-4340-85A3-A5531E510DB2}">
+      <thm15:themeFamily xmlns:thm15="http://schemas.microsoft.com/office/thememl/2012/main" name="Office Theme" id="{2E142A2C-CD16-42D6-873A-C26D2A0506FA}" vid="{1BDDFF52-6CD6-40A5-AB3C-68EB2F1E4D0A}"/>
+    </a:ext>
+  </a:extLst>
 </a:theme>
 </file>
</xml_diff>

<commit_message>
ajuste dos links para os documentos do site
</commit_message>
<xml_diff>
--- a/_site/desagregacao_temporal.docx
+++ b/_site/desagregacao_temporal.docx
@@ -18,7 +18,7 @@
         <w:t xml:space="preserve">Dirceu S. Reis Jr.</w:t>
       </w:r>
     </w:p>
-    <w:bookmarkStart w:id="112" w:name="sec.desagregacao"/>
+    <w:bookmarkStart w:id="115" w:name="sec.desagregacao"/>
     <w:p>
       <w:pPr>
         <w:pStyle w:val="Heading2"/>
@@ -3932,7 +3932,7 @@
       </w:r>
     </w:p>
     <w:bookmarkEnd w:id="24"/>
-    <w:bookmarkStart w:id="25" w:name="subsec.invariancia"/>
+    <w:bookmarkStart w:id="28" w:name="subsec.invariancia"/>
     <w:p>
       <w:pPr>
         <w:pStyle w:val="Heading3"/>
@@ -10403,31 +10403,53 @@
         <w:t xml:space="preserve">de extremos de durações subdiárias a partir de informação diária, mantendo a consistência entre durações exigida por DDF/IDF baseadas em invariância de escala.</w:t>
       </w:r>
     </w:p>
-    <w:tbl>
-      <w:tblPr>
-        <w:tblStyle w:val="FigureTable"/>
-        <w:tblW w:type="auto" w:w="0"/>
-        <w:jc w:val="center"/>
-        <w:tblLook w:firstRow="0" w:lastRow="0" w:firstColumn="0" w:lastColumn="0"/>
-      </w:tblPr>
-      <w:tblGrid>
-        <w:gridCol w:w="7920"/>
-      </w:tblGrid>
-      <w:tr>
-        <w:tc>
-          <w:tcPr/>
-          <w:p>
-            <w:pPr>
-              <w:pStyle w:val="Compact"/>
-              <w:jc w:val="center"/>
-            </w:pPr>
-            <w:r>
-              <w:t xml:space="preserve">Menabde_Fig4</w:t>
-            </w:r>
-          </w:p>
-        </w:tc>
-      </w:tr>
-    </w:tbl>
+    <w:p>
+      <w:pPr>
+        <w:pStyle w:val="CaptionedFigure"/>
+      </w:pPr>
+      <w:r>
+        <w:drawing>
+          <wp:inline>
+            <wp:extent cx="3665284" cy="5309667"/>
+            <wp:effectExtent b="0" l="0" r="0" t="0"/>
+            <wp:docPr descr="Menabde_Fig4" title="" id="26" name="Picture"/>
+            <a:graphic>
+              <a:graphicData uri="http://schemas.openxmlformats.org/drawingml/2006/picture">
+                <pic:pic>
+                  <pic:nvPicPr>
+                    <pic:cNvPr descr="figuras/Menabde_Fig4.png" id="27" name="Picture"/>
+                    <pic:cNvPicPr>
+                      <a:picLocks noChangeArrowheads="1" noChangeAspect="1"/>
+                    </pic:cNvPicPr>
+                  </pic:nvPicPr>
+                  <pic:blipFill>
+                    <a:blip r:embed="rId25"/>
+                    <a:stretch>
+                      <a:fillRect/>
+                    </a:stretch>
+                  </pic:blipFill>
+                  <pic:spPr bwMode="auto">
+                    <a:xfrm>
+                      <a:off x="0" y="0"/>
+                      <a:ext cx="3665284" cy="5309667"/>
+                    </a:xfrm>
+                    <a:prstGeom prst="rect">
+                      <a:avLst/>
+                    </a:prstGeom>
+                    <a:noFill/>
+                    <a:ln w="9525">
+                      <a:noFill/>
+                      <a:headEnd/>
+                      <a:tailEnd/>
+                    </a:ln>
+                  </pic:spPr>
+                </pic:pic>
+              </a:graphicData>
+            </a:graphic>
+          </wp:inline>
+        </w:drawing>
+      </w:r>
+    </w:p>
     <w:p>
       <w:pPr>
         <w:pStyle w:val="ImageCaption"/>
@@ -20349,8 +20371,8 @@
         <w:t xml:space="preserve">. Em síntese, o trabalho estende a invariância de escala para uma curva de três parâmetros com duração ajustada, fornece um procedimento de calibração robusto e reduz a parametrização necessária para múltiplos períodos de retorno mantendo consistência estatística entre durações.</w:t>
       </w:r>
     </w:p>
-    <w:bookmarkEnd w:id="25"/>
-    <w:bookmarkStart w:id="26" w:name="técnicas-não-paramétricas-reamostragem"/>
+    <w:bookmarkEnd w:id="28"/>
+    <w:bookmarkStart w:id="29" w:name="técnicas-não-paramétricas-reamostragem"/>
     <w:p>
       <w:pPr>
         <w:pStyle w:val="Heading3"/>
@@ -23534,8 +23556,8 @@
         <w:t xml:space="preserve">para não distorcer as marginais. Os autores demonstram o método em precipitação mensal para horária e em séries com tendências, evidenciando desempenho e robustez. Em contextos com dados finos escassos, o DiPMaC pode ser acoplado a estruturas espaciais para produzir campos subdiários.</w:t>
       </w:r>
     </w:p>
-    <w:bookmarkEnd w:id="26"/>
-    <w:bookmarkStart w:id="27" w:name="modelagem-hierárquica-de-extremos"/>
+    <w:bookmarkEnd w:id="29"/>
+    <w:bookmarkStart w:id="30" w:name="modelagem-hierárquica-de-extremos"/>
     <w:p>
       <w:pPr>
         <w:pStyle w:val="Heading3"/>
@@ -29704,8 +29726,8 @@
         <w:t xml:space="preserve">apresentam uma síntese abrangente de métodos e aplicações (máximos anuais, picos acima de um limiar, precipitação máxima provável, não-estacionariedade, IDFs, incerteza e variabilidade espacial), útil como guia metodológico por região/clima.</w:t>
       </w:r>
     </w:p>
-    <w:bookmarkEnd w:id="27"/>
-    <w:bookmarkStart w:id="111" w:name="referências"/>
+    <w:bookmarkEnd w:id="30"/>
+    <w:bookmarkStart w:id="114" w:name="referências"/>
     <w:p>
       <w:pPr>
         <w:pStyle w:val="Heading3"/>
@@ -29714,8 +29736,8 @@
         <w:t xml:space="preserve">1.6 Referências</w:t>
       </w:r>
     </w:p>
-    <w:bookmarkStart w:id="110" w:name="refs"/>
-    <w:bookmarkStart w:id="29" w:name="ref-Abreu.2022"/>
+    <w:bookmarkStart w:id="113" w:name="refs"/>
+    <w:bookmarkStart w:id="32" w:name="ref-Abreu.2022"/>
     <w:p>
       <w:pPr>
         <w:pStyle w:val="Bibliography"/>
@@ -29754,7 +29776,7 @@
       <w:r>
         <w:t xml:space="preserve"> </w:t>
       </w:r>
-      <w:hyperlink r:id="rId28">
+      <w:hyperlink r:id="rId31">
         <w:r>
           <w:rPr>
             <w:rStyle w:val="Hyperlink"/>
@@ -29766,8 +29788,8 @@
         <w:t xml:space="preserve">.</w:t>
       </w:r>
     </w:p>
-    <w:bookmarkEnd w:id="29"/>
-    <w:bookmarkStart w:id="31" w:name="ref-Aguilar.2020"/>
+    <w:bookmarkEnd w:id="32"/>
+    <w:bookmarkStart w:id="34" w:name="ref-Aguilar.2020"/>
     <w:p>
       <w:pPr>
         <w:pStyle w:val="Bibliography"/>
@@ -29806,7 +29828,7 @@
       <w:r>
         <w:t xml:space="preserve"> </w:t>
       </w:r>
-      <w:hyperlink r:id="rId30">
+      <w:hyperlink r:id="rId33">
         <w:r>
           <w:rPr>
             <w:rStyle w:val="Hyperlink"/>
@@ -29818,8 +29840,8 @@
         <w:t xml:space="preserve">.</w:t>
       </w:r>
     </w:p>
-    <w:bookmarkEnd w:id="31"/>
-    <w:bookmarkStart w:id="33" w:name="ref-Baldassarre.2006"/>
+    <w:bookmarkEnd w:id="34"/>
+    <w:bookmarkStart w:id="36" w:name="ref-Baldassarre.2006"/>
     <w:p>
       <w:pPr>
         <w:pStyle w:val="Bibliography"/>
@@ -29858,7 +29880,7 @@
       <w:r>
         <w:t xml:space="preserve"> </w:t>
       </w:r>
-      <w:hyperlink r:id="rId32">
+      <w:hyperlink r:id="rId35">
         <w:r>
           <w:rPr>
             <w:rStyle w:val="Hyperlink"/>
@@ -29870,8 +29892,8 @@
         <w:t xml:space="preserve">.</w:t>
       </w:r>
     </w:p>
-    <w:bookmarkEnd w:id="33"/>
-    <w:bookmarkStart w:id="35" w:name="ref-Barbosa.2023"/>
+    <w:bookmarkEnd w:id="36"/>
+    <w:bookmarkStart w:id="38" w:name="ref-Barbosa.2023"/>
     <w:p>
       <w:pPr>
         <w:pStyle w:val="Bibliography"/>
@@ -29910,7 +29932,7 @@
       <w:r>
         <w:t xml:space="preserve"> </w:t>
       </w:r>
-      <w:hyperlink r:id="rId34">
+      <w:hyperlink r:id="rId37">
         <w:r>
           <w:rPr>
             <w:rStyle w:val="Hyperlink"/>
@@ -29922,8 +29944,8 @@
         <w:t xml:space="preserve">.</w:t>
       </w:r>
     </w:p>
-    <w:bookmarkEnd w:id="35"/>
-    <w:bookmarkStart w:id="37" w:name="ref-Basso.2016"/>
+    <w:bookmarkEnd w:id="38"/>
+    <w:bookmarkStart w:id="40" w:name="ref-Basso.2016"/>
     <w:p>
       <w:pPr>
         <w:pStyle w:val="Bibliography"/>
@@ -29962,7 +29984,7 @@
       <w:r>
         <w:t xml:space="preserve"> </w:t>
       </w:r>
-      <w:hyperlink r:id="rId36">
+      <w:hyperlink r:id="rId39">
         <w:r>
           <w:rPr>
             <w:rStyle w:val="Hyperlink"/>
@@ -29974,8 +29996,8 @@
         <w:t xml:space="preserve">.</w:t>
       </w:r>
     </w:p>
-    <w:bookmarkEnd w:id="37"/>
-    <w:bookmarkStart w:id="39" w:name="ref-Blancheti5"/>
+    <w:bookmarkEnd w:id="40"/>
+    <w:bookmarkStart w:id="42" w:name="ref-Blancheti5"/>
     <w:p>
       <w:pPr>
         <w:pStyle w:val="Bibliography"/>
@@ -30014,7 +30036,7 @@
       <w:r>
         <w:t xml:space="preserve"> </w:t>
       </w:r>
-      <w:hyperlink r:id="rId38">
+      <w:hyperlink r:id="rId41">
         <w:r>
           <w:rPr>
             <w:rStyle w:val="Hyperlink"/>
@@ -30026,8 +30048,8 @@
         <w:t xml:space="preserve">.</w:t>
       </w:r>
     </w:p>
-    <w:bookmarkEnd w:id="39"/>
-    <w:bookmarkStart w:id="41" w:name="ref-Borga.2005"/>
+    <w:bookmarkEnd w:id="42"/>
+    <w:bookmarkStart w:id="44" w:name="ref-Borga.2005"/>
     <w:p>
       <w:pPr>
         <w:pStyle w:val="Bibliography"/>
@@ -30066,7 +30088,7 @@
       <w:r>
         <w:t xml:space="preserve"> </w:t>
       </w:r>
-      <w:hyperlink r:id="rId40">
+      <w:hyperlink r:id="rId43">
         <w:r>
           <w:rPr>
             <w:rStyle w:val="Hyperlink"/>
@@ -30078,8 +30100,8 @@
         <w:t xml:space="preserve">.</w:t>
       </w:r>
     </w:p>
-    <w:bookmarkEnd w:id="41"/>
-    <w:bookmarkStart w:id="43" w:name="ref-Burlando.1996"/>
+    <w:bookmarkEnd w:id="44"/>
+    <w:bookmarkStart w:id="46" w:name="ref-Burlando.1996"/>
     <w:p>
       <w:pPr>
         <w:pStyle w:val="Bibliography"/>
@@ -30118,7 +30140,7 @@
       <w:r>
         <w:t xml:space="preserve"> </w:t>
       </w:r>
-      <w:hyperlink r:id="rId42">
+      <w:hyperlink r:id="rId45">
         <w:r>
           <w:rPr>
             <w:rStyle w:val="Hyperlink"/>
@@ -30130,8 +30152,8 @@
         <w:t xml:space="preserve">.</w:t>
       </w:r>
     </w:p>
-    <w:bookmarkEnd w:id="43"/>
-    <w:bookmarkStart w:id="45" w:name="ref-Cannon.2018"/>
+    <w:bookmarkEnd w:id="46"/>
+    <w:bookmarkStart w:id="48" w:name="ref-Cannon.2018"/>
     <w:p>
       <w:pPr>
         <w:pStyle w:val="Bibliography"/>
@@ -30154,7 +30176,7 @@
       <w:r>
         <w:t xml:space="preserve"> </w:t>
       </w:r>
-      <w:hyperlink r:id="rId44">
+      <w:hyperlink r:id="rId47">
         <w:r>
           <w:rPr>
             <w:rStyle w:val="Hyperlink"/>
@@ -30166,8 +30188,8 @@
         <w:t xml:space="preserve">.</w:t>
       </w:r>
     </w:p>
-    <w:bookmarkEnd w:id="45"/>
-    <w:bookmarkStart w:id="47" w:name="ref-Courty.2019"/>
+    <w:bookmarkEnd w:id="48"/>
+    <w:bookmarkStart w:id="50" w:name="ref-Courty.2019"/>
     <w:p>
       <w:pPr>
         <w:pStyle w:val="Bibliography"/>
@@ -30206,7 +30228,7 @@
       <w:r>
         <w:t xml:space="preserve"> </w:t>
       </w:r>
-      <w:hyperlink r:id="rId46">
+      <w:hyperlink r:id="rId49">
         <w:r>
           <w:rPr>
             <w:rStyle w:val="Hyperlink"/>
@@ -30218,8 +30240,8 @@
         <w:t xml:space="preserve">.</w:t>
       </w:r>
     </w:p>
-    <w:bookmarkEnd w:id="47"/>
-    <w:bookmarkStart w:id="49" w:name="ref-Creaco.2024"/>
+    <w:bookmarkEnd w:id="50"/>
+    <w:bookmarkStart w:id="52" w:name="ref-Creaco.2024"/>
     <w:p>
       <w:pPr>
         <w:pStyle w:val="Bibliography"/>
@@ -30258,7 +30280,7 @@
       <w:r>
         <w:t xml:space="preserve"> </w:t>
       </w:r>
-      <w:hyperlink r:id="rId48">
+      <w:hyperlink r:id="rId51">
         <w:r>
           <w:rPr>
             <w:rStyle w:val="Hyperlink"/>
@@ -30270,8 +30292,8 @@
         <w:t xml:space="preserve">.</w:t>
       </w:r>
     </w:p>
-    <w:bookmarkEnd w:id="49"/>
-    <w:bookmarkStart w:id="51" w:name="ref-Ghanmi.2016"/>
+    <w:bookmarkEnd w:id="52"/>
+    <w:bookmarkStart w:id="54" w:name="ref-Ghanmi.2016"/>
     <w:p>
       <w:pPr>
         <w:pStyle w:val="Bibliography"/>
@@ -30310,7 +30332,7 @@
       <w:r>
         <w:t xml:space="preserve"> </w:t>
       </w:r>
-      <w:hyperlink r:id="rId50">
+      <w:hyperlink r:id="rId53">
         <w:r>
           <w:rPr>
             <w:rStyle w:val="Hyperlink"/>
@@ -30322,8 +30344,8 @@
         <w:t xml:space="preserve">.</w:t>
       </w:r>
     </w:p>
-    <w:bookmarkEnd w:id="51"/>
-    <w:bookmarkStart w:id="53" w:name="ref-Gnecco.2023"/>
+    <w:bookmarkEnd w:id="54"/>
+    <w:bookmarkStart w:id="56" w:name="ref-Gnecco.2023"/>
     <w:p>
       <w:pPr>
         <w:pStyle w:val="Bibliography"/>
@@ -30362,7 +30384,7 @@
       <w:r>
         <w:t xml:space="preserve"> </w:t>
       </w:r>
-      <w:hyperlink r:id="rId52">
+      <w:hyperlink r:id="rId55">
         <w:r>
           <w:rPr>
             <w:rStyle w:val="Hyperlink"/>
@@ -30374,8 +30396,8 @@
         <w:t xml:space="preserve">.</w:t>
       </w:r>
     </w:p>
-    <w:bookmarkEnd w:id="53"/>
-    <w:bookmarkStart w:id="55" w:name="ref-Gu.2022"/>
+    <w:bookmarkEnd w:id="56"/>
+    <w:bookmarkStart w:id="58" w:name="ref-Gu.2022"/>
     <w:p>
       <w:pPr>
         <w:pStyle w:val="Bibliography"/>
@@ -30414,7 +30436,7 @@
       <w:r>
         <w:t xml:space="preserve"> </w:t>
       </w:r>
-      <w:hyperlink r:id="rId54">
+      <w:hyperlink r:id="rId57">
         <w:r>
           <w:rPr>
             <w:rStyle w:val="Hyperlink"/>
@@ -30426,8 +30448,8 @@
         <w:t xml:space="preserve">.</w:t>
       </w:r>
     </w:p>
-    <w:bookmarkEnd w:id="55"/>
-    <w:bookmarkStart w:id="57" w:name="ref-Gupta.1990"/>
+    <w:bookmarkEnd w:id="58"/>
+    <w:bookmarkStart w:id="60" w:name="ref-Gupta.1990"/>
     <w:p>
       <w:pPr>
         <w:pStyle w:val="Bibliography"/>
@@ -30466,7 +30488,7 @@
       <w:r>
         <w:t xml:space="preserve"> </w:t>
       </w:r>
-      <w:hyperlink r:id="rId56">
+      <w:hyperlink r:id="rId59">
         <w:r>
           <w:rPr>
             <w:rStyle w:val="Hyperlink"/>
@@ -30478,8 +30500,8 @@
         <w:t xml:space="preserve">.</w:t>
       </w:r>
     </w:p>
-    <w:bookmarkEnd w:id="57"/>
-    <w:bookmarkStart w:id="59" w:name="ref-KOSSIERIS2018980"/>
+    <w:bookmarkEnd w:id="60"/>
+    <w:bookmarkStart w:id="62" w:name="ref-KOSSIERIS2018980"/>
     <w:p>
       <w:pPr>
         <w:pStyle w:val="Bibliography"/>
@@ -30509,7 +30531,7 @@
       <w:r>
         <w:t xml:space="preserve">556: 980–92. https://doi.org/</w:t>
       </w:r>
-      <w:hyperlink r:id="rId58">
+      <w:hyperlink r:id="rId61">
         <w:r>
           <w:rPr>
             <w:rStyle w:val="Hyperlink"/>
@@ -30521,8 +30543,8 @@
         <w:t xml:space="preserve">.</w:t>
       </w:r>
     </w:p>
-    <w:bookmarkEnd w:id="59"/>
-    <w:bookmarkStart w:id="61" w:name="ref-Koutsoyiannis.1993"/>
+    <w:bookmarkEnd w:id="62"/>
+    <w:bookmarkStart w:id="64" w:name="ref-Koutsoyiannis.1993"/>
     <w:p>
       <w:pPr>
         <w:pStyle w:val="Bibliography"/>
@@ -30561,7 +30583,7 @@
       <w:r>
         <w:t xml:space="preserve"> </w:t>
       </w:r>
-      <w:hyperlink r:id="rId60">
+      <w:hyperlink r:id="rId63">
         <w:r>
           <w:rPr>
             <w:rStyle w:val="Hyperlink"/>
@@ -30573,8 +30595,8 @@
         <w:t xml:space="preserve">.</w:t>
       </w:r>
     </w:p>
-    <w:bookmarkEnd w:id="61"/>
-    <w:bookmarkStart w:id="63" w:name="ref-KOUTSOYIANNIS1998118"/>
+    <w:bookmarkEnd w:id="64"/>
+    <w:bookmarkStart w:id="66" w:name="ref-KOUTSOYIANNIS1998118"/>
     <w:p>
       <w:pPr>
         <w:pStyle w:val="Bibliography"/>
@@ -30604,7 +30626,7 @@
       <w:r>
         <w:t xml:space="preserve">206 (1): 118–35. https://doi.org/</w:t>
       </w:r>
-      <w:hyperlink r:id="rId62">
+      <w:hyperlink r:id="rId65">
         <w:r>
           <w:rPr>
             <w:rStyle w:val="Hyperlink"/>
@@ -30616,8 +30638,8 @@
         <w:t xml:space="preserve">.</w:t>
       </w:r>
     </w:p>
-    <w:bookmarkEnd w:id="63"/>
-    <w:bookmarkStart w:id="65" w:name="ref-KOUTSOYIANNIS2001109"/>
+    <w:bookmarkEnd w:id="66"/>
+    <w:bookmarkStart w:id="68" w:name="ref-KOUTSOYIANNIS2001109"/>
     <w:p>
       <w:pPr>
         <w:pStyle w:val="Bibliography"/>
@@ -30647,7 +30669,7 @@
       <w:r>
         <w:t xml:space="preserve">246 (1): 109–22. https://doi.org/</w:t>
       </w:r>
-      <w:hyperlink r:id="rId64">
+      <w:hyperlink r:id="rId67">
         <w:r>
           <w:rPr>
             <w:rStyle w:val="Hyperlink"/>
@@ -30659,8 +30681,8 @@
         <w:t xml:space="preserve">.</w:t>
       </w:r>
     </w:p>
-    <w:bookmarkEnd w:id="65"/>
-    <w:bookmarkStart w:id="67" w:name="ref-Langousis.2007"/>
+    <w:bookmarkEnd w:id="68"/>
+    <w:bookmarkStart w:id="70" w:name="ref-Langousis.2007"/>
     <w:p>
       <w:pPr>
         <w:pStyle w:val="Bibliography"/>
@@ -30699,7 +30721,7 @@
       <w:r>
         <w:t xml:space="preserve"> </w:t>
       </w:r>
-      <w:hyperlink r:id="rId66">
+      <w:hyperlink r:id="rId69">
         <w:r>
           <w:rPr>
             <w:rStyle w:val="Hyperlink"/>
@@ -30711,8 +30733,8 @@
         <w:t xml:space="preserve">.</w:t>
       </w:r>
     </w:p>
-    <w:bookmarkEnd w:id="67"/>
-    <w:bookmarkStart w:id="69" w:name="ref-Le.2018"/>
+    <w:bookmarkEnd w:id="70"/>
+    <w:bookmarkStart w:id="72" w:name="ref-Le.2018"/>
     <w:p>
       <w:pPr>
         <w:pStyle w:val="Bibliography"/>
@@ -30751,7 +30773,7 @@
       <w:r>
         <w:t xml:space="preserve"> </w:t>
       </w:r>
-      <w:hyperlink r:id="rId68">
+      <w:hyperlink r:id="rId71">
         <w:r>
           <w:rPr>
             <w:rStyle w:val="Hyperlink"/>
@@ -30763,8 +30785,8 @@
         <w:t xml:space="preserve">.</w:t>
       </w:r>
     </w:p>
-    <w:bookmarkEnd w:id="69"/>
-    <w:bookmarkStart w:id="71" w:name="ref-LIMA2016744"/>
+    <w:bookmarkEnd w:id="72"/>
+    <w:bookmarkStart w:id="74" w:name="ref-LIMA2016744"/>
     <w:p>
       <w:pPr>
         <w:pStyle w:val="Bibliography"/>
@@ -30794,7 +30816,7 @@
       <w:r>
         <w:t xml:space="preserve">540: 744–56. https://doi.org/</w:t>
       </w:r>
-      <w:hyperlink r:id="rId70">
+      <w:hyperlink r:id="rId73">
         <w:r>
           <w:rPr>
             <w:rStyle w:val="Hyperlink"/>
@@ -30806,8 +30828,8 @@
         <w:t xml:space="preserve">.</w:t>
       </w:r>
     </w:p>
-    <w:bookmarkEnd w:id="71"/>
-    <w:bookmarkStart w:id="73" w:name="ref-Lima.2018"/>
+    <w:bookmarkEnd w:id="74"/>
+    <w:bookmarkStart w:id="76" w:name="ref-Lima.2018"/>
     <w:p>
       <w:pPr>
         <w:pStyle w:val="Bibliography"/>
@@ -30846,7 +30868,7 @@
       <w:r>
         <w:t xml:space="preserve"> </w:t>
       </w:r>
-      <w:hyperlink r:id="rId72">
+      <w:hyperlink r:id="rId75">
         <w:r>
           <w:rPr>
             <w:rStyle w:val="Hyperlink"/>
@@ -30858,8 +30880,8 @@
         <w:t xml:space="preserve">.</w:t>
       </w:r>
     </w:p>
-    <w:bookmarkEnd w:id="73"/>
-    <w:bookmarkStart w:id="75" w:name="ref-Lovejoy.1985"/>
+    <w:bookmarkEnd w:id="76"/>
+    <w:bookmarkStart w:id="78" w:name="ref-Lovejoy.1985"/>
     <w:p>
       <w:pPr>
         <w:pStyle w:val="Bibliography"/>
@@ -30898,7 +30920,7 @@
       <w:r>
         <w:t xml:space="preserve"> </w:t>
       </w:r>
-      <w:hyperlink r:id="rId74">
+      <w:hyperlink r:id="rId77">
         <w:r>
           <w:rPr>
             <w:rStyle w:val="Hyperlink"/>
@@ -30910,8 +30932,8 @@
         <w:t xml:space="preserve">.</w:t>
       </w:r>
     </w:p>
-    <w:bookmarkEnd w:id="75"/>
-    <w:bookmarkStart w:id="77" w:name="ref-Lovejoy.1986"/>
+    <w:bookmarkEnd w:id="78"/>
+    <w:bookmarkStart w:id="80" w:name="ref-Lovejoy.1986"/>
     <w:p>
       <w:pPr>
         <w:pStyle w:val="Bibliography"/>
@@ -30950,7 +30972,7 @@
       <w:r>
         <w:t xml:space="preserve"> </w:t>
       </w:r>
-      <w:hyperlink r:id="rId76">
+      <w:hyperlink r:id="rId79">
         <w:r>
           <w:rPr>
             <w:rStyle w:val="Hyperlink"/>
@@ -30962,8 +30984,8 @@
         <w:t xml:space="preserve">.</w:t>
       </w:r>
     </w:p>
-    <w:bookmarkEnd w:id="77"/>
-    <w:bookmarkStart w:id="79" w:name="ref-Mandelbrot.1968"/>
+    <w:bookmarkEnd w:id="80"/>
+    <w:bookmarkStart w:id="82" w:name="ref-Mandelbrot.1968"/>
     <w:p>
       <w:pPr>
         <w:pStyle w:val="Bibliography"/>
@@ -31002,7 +31024,7 @@
       <w:r>
         <w:t xml:space="preserve"> </w:t>
       </w:r>
-      <w:hyperlink r:id="rId78">
+      <w:hyperlink r:id="rId81">
         <w:r>
           <w:rPr>
             <w:rStyle w:val="Hyperlink"/>
@@ -31014,8 +31036,8 @@
         <w:t xml:space="preserve">.</w:t>
       </w:r>
     </w:p>
-    <w:bookmarkEnd w:id="79"/>
-    <w:bookmarkStart w:id="81" w:name="ref-Mascaro.2020"/>
+    <w:bookmarkEnd w:id="82"/>
+    <w:bookmarkStart w:id="84" w:name="ref-Mascaro.2020"/>
     <w:p>
       <w:pPr>
         <w:pStyle w:val="Bibliography"/>
@@ -31054,7 +31076,7 @@
       <w:r>
         <w:t xml:space="preserve"> </w:t>
       </w:r>
-      <w:hyperlink r:id="rId80">
+      <w:hyperlink r:id="rId83">
         <w:r>
           <w:rPr>
             <w:rStyle w:val="Hyperlink"/>
@@ -31066,8 +31088,8 @@
         <w:t xml:space="preserve">.</w:t>
       </w:r>
     </w:p>
-    <w:bookmarkEnd w:id="81"/>
-    <w:bookmarkStart w:id="83" w:name="ref-Menabde.1997"/>
+    <w:bookmarkEnd w:id="84"/>
+    <w:bookmarkStart w:id="86" w:name="ref-Menabde.1997"/>
     <w:p>
       <w:pPr>
         <w:pStyle w:val="Bibliography"/>
@@ -31106,7 +31128,7 @@
       <w:r>
         <w:t xml:space="preserve"> </w:t>
       </w:r>
-      <w:hyperlink r:id="rId82">
+      <w:hyperlink r:id="rId85">
         <w:r>
           <w:rPr>
             <w:rStyle w:val="Hyperlink"/>
@@ -31118,8 +31140,8 @@
         <w:t xml:space="preserve">.</w:t>
       </w:r>
     </w:p>
-    <w:bookmarkEnd w:id="83"/>
-    <w:bookmarkStart w:id="85" w:name="ref-Menabde.1999"/>
+    <w:bookmarkEnd w:id="86"/>
+    <w:bookmarkStart w:id="88" w:name="ref-Menabde.1999"/>
     <w:p>
       <w:pPr>
         <w:pStyle w:val="Bibliography"/>
@@ -31158,7 +31180,7 @@
       <w:r>
         <w:t xml:space="preserve"> </w:t>
       </w:r>
-      <w:hyperlink r:id="rId84">
+      <w:hyperlink r:id="rId87">
         <w:r>
           <w:rPr>
             <w:rStyle w:val="Hyperlink"/>
@@ -31170,8 +31192,8 @@
         <w:t xml:space="preserve">.</w:t>
       </w:r>
     </w:p>
-    <w:bookmarkEnd w:id="85"/>
-    <w:bookmarkStart w:id="87" w:name="ref-Nguyen.1998"/>
+    <w:bookmarkEnd w:id="88"/>
+    <w:bookmarkStart w:id="90" w:name="ref-Nguyen.1998"/>
     <w:p>
       <w:pPr>
         <w:pStyle w:val="Bibliography"/>
@@ -31210,7 +31232,7 @@
       <w:r>
         <w:t xml:space="preserve"> </w:t>
       </w:r>
-      <w:hyperlink r:id="rId86">
+      <w:hyperlink r:id="rId89">
         <w:r>
           <w:rPr>
             <w:rStyle w:val="Hyperlink"/>
@@ -31222,8 +31244,8 @@
         <w:t xml:space="preserve">.</w:t>
       </w:r>
     </w:p>
-    <w:bookmarkEnd w:id="87"/>
-    <w:bookmarkStart w:id="89" w:name="ref-Papalexiou.2018"/>
+    <w:bookmarkEnd w:id="90"/>
+    <w:bookmarkStart w:id="92" w:name="ref-Papalexiou.2018"/>
     <w:p>
       <w:pPr>
         <w:pStyle w:val="Bibliography"/>
@@ -31262,7 +31284,7 @@
       <w:r>
         <w:t xml:space="preserve"> </w:t>
       </w:r>
-      <w:hyperlink r:id="rId88">
+      <w:hyperlink r:id="rId91">
         <w:r>
           <w:rPr>
             <w:rStyle w:val="Hyperlink"/>
@@ -31274,8 +31296,8 @@
         <w:t xml:space="preserve">.</w:t>
       </w:r>
     </w:p>
-    <w:bookmarkEnd w:id="89"/>
-    <w:bookmarkStart w:id="91" w:name="ref-Qin.2024"/>
+    <w:bookmarkEnd w:id="92"/>
+    <w:bookmarkStart w:id="94" w:name="ref-Qin.2024"/>
     <w:p>
       <w:pPr>
         <w:pStyle w:val="Bibliography"/>
@@ -31314,7 +31336,7 @@
       <w:r>
         <w:t xml:space="preserve"> </w:t>
       </w:r>
-      <w:hyperlink r:id="rId90">
+      <w:hyperlink r:id="rId93">
         <w:r>
           <w:rPr>
             <w:rStyle w:val="Hyperlink"/>
@@ -31326,8 +31348,8 @@
         <w:t xml:space="preserve">.</w:t>
       </w:r>
     </w:p>
-    <w:bookmarkEnd w:id="91"/>
-    <w:bookmarkStart w:id="93" w:name="ref-Requena.2021"/>
+    <w:bookmarkEnd w:id="94"/>
+    <w:bookmarkStart w:id="96" w:name="ref-Requena.2021"/>
     <w:p>
       <w:pPr>
         <w:pStyle w:val="Bibliography"/>
@@ -31366,7 +31388,7 @@
       <w:r>
         <w:t xml:space="preserve"> </w:t>
       </w:r>
-      <w:hyperlink r:id="rId92">
+      <w:hyperlink r:id="rId95">
         <w:r>
           <w:rPr>
             <w:rStyle w:val="Hyperlink"/>
@@ -31378,8 +31400,8 @@
         <w:t xml:space="preserve">.</w:t>
       </w:r>
     </w:p>
-    <w:bookmarkEnd w:id="93"/>
-    <w:bookmarkStart w:id="95" w:name="ref-Rodrigues.2023"/>
+    <w:bookmarkEnd w:id="96"/>
+    <w:bookmarkStart w:id="98" w:name="ref-Rodrigues.2023"/>
     <w:p>
       <w:pPr>
         <w:pStyle w:val="Bibliography"/>
@@ -31418,7 +31440,7 @@
       <w:r>
         <w:t xml:space="preserve"> </w:t>
       </w:r>
-      <w:hyperlink r:id="rId94">
+      <w:hyperlink r:id="rId97">
         <w:r>
           <w:rPr>
             <w:rStyle w:val="Hyperlink"/>
@@ -31430,8 +31452,8 @@
         <w:t xml:space="preserve">.</w:t>
       </w:r>
     </w:p>
-    <w:bookmarkEnd w:id="95"/>
-    <w:bookmarkStart w:id="97" w:name="ref-Sane.2018"/>
+    <w:bookmarkEnd w:id="98"/>
+    <w:bookmarkStart w:id="100" w:name="ref-Sane.2018"/>
     <w:p>
       <w:pPr>
         <w:pStyle w:val="Bibliography"/>
@@ -31470,7 +31492,7 @@
       <w:r>
         <w:t xml:space="preserve"> </w:t>
       </w:r>
-      <w:hyperlink r:id="rId96">
+      <w:hyperlink r:id="rId99">
         <w:r>
           <w:rPr>
             <w:rStyle w:val="Hyperlink"/>
@@ -31482,8 +31504,8 @@
         <w:t xml:space="preserve">.</w:t>
       </w:r>
     </w:p>
-    <w:bookmarkEnd w:id="97"/>
-    <w:bookmarkStart w:id="99" w:name="ref-Stephenson.2016"/>
+    <w:bookmarkEnd w:id="100"/>
+    <w:bookmarkStart w:id="102" w:name="ref-Stephenson.2016"/>
     <w:p>
       <w:pPr>
         <w:pStyle w:val="Bibliography"/>
@@ -31522,7 +31544,7 @@
       <w:r>
         <w:t xml:space="preserve"> </w:t>
       </w:r>
-      <w:hyperlink r:id="rId98">
+      <w:hyperlink r:id="rId101">
         <w:r>
           <w:rPr>
             <w:rStyle w:val="Hyperlink"/>
@@ -31534,8 +31556,8 @@
         <w:t xml:space="preserve">.</w:t>
       </w:r>
     </w:p>
-    <w:bookmarkEnd w:id="99"/>
-    <w:bookmarkStart w:id="101" w:name="ref-Tayşi.2021"/>
+    <w:bookmarkEnd w:id="102"/>
+    <w:bookmarkStart w:id="104" w:name="ref-Tayşi.2021"/>
     <w:p>
       <w:pPr>
         <w:pStyle w:val="Bibliography"/>
@@ -31574,7 +31596,7 @@
       <w:r>
         <w:t xml:space="preserve"> </w:t>
       </w:r>
-      <w:hyperlink r:id="rId100">
+      <w:hyperlink r:id="rId103">
         <w:r>
           <w:rPr>
             <w:rStyle w:val="Hyperlink"/>
@@ -31586,8 +31608,8 @@
         <w:t xml:space="preserve">.</w:t>
       </w:r>
     </w:p>
-    <w:bookmarkEnd w:id="101"/>
-    <w:bookmarkStart w:id="103" w:name="ref-Vorobevskii.2023"/>
+    <w:bookmarkEnd w:id="104"/>
+    <w:bookmarkStart w:id="106" w:name="ref-Vorobevskii.2023"/>
     <w:p>
       <w:pPr>
         <w:pStyle w:val="Bibliography"/>
@@ -31626,7 +31648,7 @@
       <w:r>
         <w:t xml:space="preserve"> </w:t>
       </w:r>
-      <w:hyperlink r:id="rId102">
+      <w:hyperlink r:id="rId105">
         <w:r>
           <w:rPr>
             <w:rStyle w:val="Hyperlink"/>
@@ -31638,8 +31660,8 @@
         <w:t xml:space="preserve">.</w:t>
       </w:r>
     </w:p>
-    <w:bookmarkEnd w:id="103"/>
-    <w:bookmarkStart w:id="105" w:name="ref-Vyver.2018"/>
+    <w:bookmarkEnd w:id="106"/>
+    <w:bookmarkStart w:id="108" w:name="ref-Vyver.2018"/>
     <w:p>
       <w:pPr>
         <w:pStyle w:val="Bibliography"/>
@@ -31678,7 +31700,7 @@
       <w:r>
         <w:t xml:space="preserve"> </w:t>
       </w:r>
-      <w:hyperlink r:id="rId104">
+      <w:hyperlink r:id="rId107">
         <w:r>
           <w:rPr>
             <w:rStyle w:val="Hyperlink"/>
@@ -31690,8 +31712,8 @@
         <w:t xml:space="preserve">.</w:t>
       </w:r>
     </w:p>
-    <w:bookmarkEnd w:id="105"/>
-    <w:bookmarkStart w:id="107" w:name="ref-Wang.2024"/>
+    <w:bookmarkEnd w:id="108"/>
+    <w:bookmarkStart w:id="110" w:name="ref-Wang.2024"/>
     <w:p>
       <w:pPr>
         <w:pStyle w:val="Bibliography"/>
@@ -31730,7 +31752,7 @@
       <w:r>
         <w:t xml:space="preserve"> </w:t>
       </w:r>
-      <w:hyperlink r:id="rId106">
+      <w:hyperlink r:id="rId109">
         <w:r>
           <w:rPr>
             <w:rStyle w:val="Hyperlink"/>
@@ -31742,8 +31764,8 @@
         <w:t xml:space="preserve">.</w:t>
       </w:r>
     </w:p>
-    <w:bookmarkEnd w:id="107"/>
-    <w:bookmarkStart w:id="109" w:name="ref-Yeo.2021"/>
+    <w:bookmarkEnd w:id="110"/>
+    <w:bookmarkStart w:id="112" w:name="ref-Yeo.2021"/>
     <w:p>
       <w:pPr>
         <w:pStyle w:val="Bibliography"/>
@@ -31782,7 +31804,7 @@
       <w:r>
         <w:t xml:space="preserve"> </w:t>
       </w:r>
-      <w:hyperlink r:id="rId108">
+      <w:hyperlink r:id="rId111">
         <w:r>
           <w:rPr>
             <w:rStyle w:val="Hyperlink"/>
@@ -31794,11 +31816,11 @@
         <w:t xml:space="preserve">.</w:t>
       </w:r>
     </w:p>
-    <w:bookmarkEnd w:id="109"/>
-    <w:bookmarkEnd w:id="110"/>
-    <w:bookmarkEnd w:id="111"/>
     <w:bookmarkEnd w:id="112"/>
-    <w:bookmarkStart w:id="113" w:name="noção-de-invariância-de-escala"/>
+    <w:bookmarkEnd w:id="113"/>
+    <w:bookmarkEnd w:id="114"/>
+    <w:bookmarkEnd w:id="115"/>
+    <w:bookmarkStart w:id="116" w:name="noção-de-invariância-de-escala"/>
     <w:p>
       <w:pPr>
         <w:pStyle w:val="Heading2"/>
@@ -31984,7 +32006,7 @@
         <w:t xml:space="preserve">.</w:t>
       </w:r>
     </w:p>
-    <w:bookmarkEnd w:id="113"/>
+    <w:bookmarkEnd w:id="116"/>
     <w:sectPr/>
   </w:body>
 </w:document>

</xml_diff>